<commit_message>
Commit true develop version
</commit_message>
<xml_diff>
--- a/change-log.docx
+++ b/change-log.docx
@@ -103,6 +103,1939 @@
       </w:r>
     </w:p>
     <w:p/>
+    <w:p>
+      <w:pPr>
+        <w:pStyle w:val="Heading1"/>
+      </w:pPr>
+      <w:r>
+        <w:t>Version 2.2.0</w:t>
+      </w:r>
+    </w:p>
+    <w:tbl>
+      <w:tblPr>
+        <w:tblStyle w:val="TableGrid"/>
+        <w:tblW w:w="0" w:type="auto"/>
+        <w:tblBorders>
+          <w:top w:val="none" w:sz="0" w:space="0" w:color="auto"/>
+          <w:left w:val="none" w:sz="0" w:space="0" w:color="auto"/>
+          <w:bottom w:val="none" w:sz="0" w:space="0" w:color="auto"/>
+          <w:right w:val="none" w:sz="0" w:space="0" w:color="auto"/>
+          <w:insideH w:val="none" w:sz="0" w:space="0" w:color="auto"/>
+          <w:insideV w:val="none" w:sz="0" w:space="0" w:color="auto"/>
+        </w:tblBorders>
+        <w:tblLayout w:type="fixed"/>
+        <w:tblCellMar>
+          <w:top w:w="57" w:type="dxa"/>
+          <w:left w:w="57" w:type="dxa"/>
+          <w:bottom w:w="57" w:type="dxa"/>
+          <w:right w:w="57" w:type="dxa"/>
+        </w:tblCellMar>
+        <w:tblLook w:val="04A0" w:firstRow="1" w:lastRow="0" w:firstColumn="1" w:lastColumn="0" w:noHBand="0" w:noVBand="1"/>
+      </w:tblPr>
+      <w:tblGrid>
+        <w:gridCol w:w="846"/>
+        <w:gridCol w:w="709"/>
+        <w:gridCol w:w="7846"/>
+      </w:tblGrid>
+      <w:tr>
+        <w:tc>
+          <w:tcPr>
+            <w:tcW w:w="846" w:type="dxa"/>
+            <w:tcBorders>
+              <w:top w:val="single" w:sz="4" w:space="0" w:color="70AD47" w:themeColor="accent6"/>
+              <w:left w:val="single" w:sz="4" w:space="0" w:color="70AD47" w:themeColor="accent6"/>
+              <w:bottom w:val="single" w:sz="4" w:space="0" w:color="70AD47" w:themeColor="accent6"/>
+              <w:right w:val="single" w:sz="4" w:space="0" w:color="70AD47" w:themeColor="accent6"/>
+            </w:tcBorders>
+            <w:shd w:val="clear" w:color="auto" w:fill="E2EFD9" w:themeFill="accent6" w:themeFillTint="33"/>
+          </w:tcPr>
+          <w:p>
+            <w:pPr>
+              <w:jc w:val="center"/>
+              <w:rPr>
+                <w:b/>
+                <w:bCs/>
+              </w:rPr>
+            </w:pPr>
+            <w:r>
+              <w:rPr>
+                <w:b/>
+                <w:bCs/>
+                <w:color w:val="538135" w:themeColor="accent6" w:themeShade="BF"/>
+              </w:rPr>
+              <w:t>ADDED</w:t>
+            </w:r>
+          </w:p>
+        </w:tc>
+        <w:tc>
+          <w:tcPr>
+            <w:tcW w:w="709" w:type="dxa"/>
+            <w:tcBorders>
+              <w:left w:val="single" w:sz="4" w:space="0" w:color="70AD47" w:themeColor="accent6"/>
+            </w:tcBorders>
+          </w:tcPr>
+          <w:p/>
+        </w:tc>
+        <w:tc>
+          <w:tcPr>
+            <w:tcW w:w="7846" w:type="dxa"/>
+          </w:tcPr>
+          <w:p>
+            <w:pPr>
+              <w:rPr>
+                <w:b/>
+                <w:bCs/>
+              </w:rPr>
+            </w:pPr>
+            <w:r>
+              <w:rPr>
+                <w:b/>
+                <w:bCs/>
+              </w:rPr>
+              <w:t>Importing HD-EEG Compumedics recordings supports mixed sampling frequencies</w:t>
+            </w:r>
+          </w:p>
+        </w:tc>
+      </w:tr>
+      <w:tr>
+        <w:tc>
+          <w:tcPr>
+            <w:tcW w:w="1555" w:type="dxa"/>
+            <w:gridSpan w:val="2"/>
+            <w:shd w:val="clear" w:color="auto" w:fill="auto"/>
+          </w:tcPr>
+          <w:p>
+            <w:pPr>
+              <w:pStyle w:val="Caption"/>
+              <w:rPr>
+                <w:sz w:val="14"/>
+                <w:szCs w:val="14"/>
+              </w:rPr>
+            </w:pPr>
+            <w:r>
+              <w:rPr>
+                <w:sz w:val="14"/>
+                <w:szCs w:val="14"/>
+              </w:rPr>
+              <w:t>Version 2.</w:t>
+            </w:r>
+            <w:r>
+              <w:rPr>
+                <w:sz w:val="14"/>
+                <w:szCs w:val="14"/>
+              </w:rPr>
+              <w:t>2</w:t>
+            </w:r>
+            <w:r>
+              <w:rPr>
+                <w:sz w:val="14"/>
+                <w:szCs w:val="14"/>
+              </w:rPr>
+              <w:t>.0</w:t>
+            </w:r>
+          </w:p>
+          <w:p>
+            <w:pPr>
+              <w:pStyle w:val="Caption"/>
+              <w:rPr>
+                <w:sz w:val="14"/>
+                <w:szCs w:val="14"/>
+              </w:rPr>
+            </w:pPr>
+            <w:r>
+              <w:rPr>
+                <w:sz w:val="14"/>
+                <w:szCs w:val="14"/>
+              </w:rPr>
+              <w:t>ID #00</w:t>
+            </w:r>
+            <w:r>
+              <w:rPr>
+                <w:sz w:val="14"/>
+                <w:szCs w:val="14"/>
+              </w:rPr>
+              <w:t>2</w:t>
+            </w:r>
+            <w:r>
+              <w:rPr>
+                <w:sz w:val="14"/>
+                <w:szCs w:val="14"/>
+              </w:rPr>
+              <w:t>2</w:t>
+            </w:r>
+            <w:r>
+              <w:rPr>
+                <w:sz w:val="14"/>
+                <w:szCs w:val="14"/>
+              </w:rPr>
+              <w:br/>
+              <w:t>3 Jul 2024</w:t>
+            </w:r>
+          </w:p>
+        </w:tc>
+        <w:tc>
+          <w:tcPr>
+            <w:tcW w:w="7846" w:type="dxa"/>
+          </w:tcPr>
+          <w:p>
+            <w:r>
+              <w:t>When importing HD-EEG compumedics recordings, some channels may have been acquired at different sampling frequencies. We now support this and all channels are upsampled to the highest sampling frequency in the dataset.</w:t>
+            </w:r>
+          </w:p>
+        </w:tc>
+      </w:tr>
+    </w:tbl>
+    <w:p/>
+    <w:tbl>
+      <w:tblPr>
+        <w:tblStyle w:val="TableGrid"/>
+        <w:tblW w:w="0" w:type="auto"/>
+        <w:tblBorders>
+          <w:top w:val="none" w:sz="0" w:space="0" w:color="auto"/>
+          <w:left w:val="none" w:sz="0" w:space="0" w:color="auto"/>
+          <w:bottom w:val="none" w:sz="0" w:space="0" w:color="auto"/>
+          <w:right w:val="none" w:sz="0" w:space="0" w:color="auto"/>
+          <w:insideH w:val="none" w:sz="0" w:space="0" w:color="auto"/>
+          <w:insideV w:val="none" w:sz="0" w:space="0" w:color="auto"/>
+        </w:tblBorders>
+        <w:tblLayout w:type="fixed"/>
+        <w:tblCellMar>
+          <w:top w:w="57" w:type="dxa"/>
+          <w:left w:w="57" w:type="dxa"/>
+          <w:bottom w:w="57" w:type="dxa"/>
+          <w:right w:w="57" w:type="dxa"/>
+        </w:tblCellMar>
+        <w:tblLook w:val="04A0" w:firstRow="1" w:lastRow="0" w:firstColumn="1" w:lastColumn="0" w:noHBand="0" w:noVBand="1"/>
+      </w:tblPr>
+      <w:tblGrid>
+        <w:gridCol w:w="704"/>
+        <w:gridCol w:w="851"/>
+        <w:gridCol w:w="7846"/>
+      </w:tblGrid>
+      <w:tr>
+        <w:tc>
+          <w:tcPr>
+            <w:tcW w:w="704" w:type="dxa"/>
+            <w:tcBorders>
+              <w:top w:val="single" w:sz="4" w:space="0" w:color="4472C4" w:themeColor="accent1"/>
+              <w:left w:val="single" w:sz="4" w:space="0" w:color="4472C4" w:themeColor="accent1"/>
+              <w:bottom w:val="single" w:sz="4" w:space="0" w:color="4472C4" w:themeColor="accent1"/>
+              <w:right w:val="single" w:sz="4" w:space="0" w:color="4472C4" w:themeColor="accent1"/>
+            </w:tcBorders>
+            <w:shd w:val="clear" w:color="auto" w:fill="DEEAF6" w:themeFill="accent5" w:themeFillTint="33"/>
+          </w:tcPr>
+          <w:p>
+            <w:pPr>
+              <w:jc w:val="center"/>
+              <w:rPr>
+                <w:b/>
+                <w:bCs/>
+              </w:rPr>
+            </w:pPr>
+            <w:r>
+              <w:rPr>
+                <w:b/>
+                <w:bCs/>
+                <w:color w:val="2F5496" w:themeColor="accent1" w:themeShade="BF"/>
+              </w:rPr>
+              <w:t>FIXED</w:t>
+            </w:r>
+          </w:p>
+        </w:tc>
+        <w:tc>
+          <w:tcPr>
+            <w:tcW w:w="851" w:type="dxa"/>
+            <w:tcBorders>
+              <w:left w:val="single" w:sz="4" w:space="0" w:color="4472C4" w:themeColor="accent1"/>
+            </w:tcBorders>
+          </w:tcPr>
+          <w:p/>
+        </w:tc>
+        <w:tc>
+          <w:tcPr>
+            <w:tcW w:w="7846" w:type="dxa"/>
+          </w:tcPr>
+          <w:p>
+            <w:pPr>
+              <w:rPr>
+                <w:b/>
+                <w:bCs/>
+              </w:rPr>
+            </w:pPr>
+            <w:r>
+              <w:rPr>
+                <w:b/>
+                <w:bCs/>
+              </w:rPr>
+              <w:t>Importing “Event_*.xml” files from the MFF package</w:t>
+            </w:r>
+          </w:p>
+        </w:tc>
+      </w:tr>
+      <w:tr>
+        <w:tc>
+          <w:tcPr>
+            <w:tcW w:w="1555" w:type="dxa"/>
+            <w:gridSpan w:val="2"/>
+            <w:shd w:val="clear" w:color="auto" w:fill="auto"/>
+          </w:tcPr>
+          <w:p>
+            <w:pPr>
+              <w:pStyle w:val="Caption"/>
+              <w:rPr>
+                <w:sz w:val="14"/>
+                <w:szCs w:val="14"/>
+              </w:rPr>
+            </w:pPr>
+            <w:r>
+              <w:rPr>
+                <w:sz w:val="14"/>
+                <w:szCs w:val="14"/>
+              </w:rPr>
+              <w:t>Version 2.</w:t>
+            </w:r>
+            <w:r>
+              <w:rPr>
+                <w:sz w:val="14"/>
+                <w:szCs w:val="14"/>
+              </w:rPr>
+              <w:t>2</w:t>
+            </w:r>
+            <w:r>
+              <w:rPr>
+                <w:sz w:val="14"/>
+                <w:szCs w:val="14"/>
+              </w:rPr>
+              <w:t>.0</w:t>
+            </w:r>
+            <w:r>
+              <w:rPr>
+                <w:sz w:val="14"/>
+                <w:szCs w:val="14"/>
+              </w:rPr>
+              <w:br/>
+            </w:r>
+            <w:r>
+              <w:rPr>
+                <w:sz w:val="14"/>
+                <w:szCs w:val="14"/>
+              </w:rPr>
+              <w:t>ID #00</w:t>
+            </w:r>
+            <w:r>
+              <w:rPr>
+                <w:sz w:val="14"/>
+                <w:szCs w:val="14"/>
+              </w:rPr>
+              <w:t>21</w:t>
+            </w:r>
+            <w:r>
+              <w:rPr>
+                <w:sz w:val="14"/>
+                <w:szCs w:val="14"/>
+              </w:rPr>
+              <w:br/>
+              <w:t>4 Jun 2024</w:t>
+            </w:r>
+          </w:p>
+        </w:tc>
+        <w:tc>
+          <w:tcPr>
+            <w:tcW w:w="7846" w:type="dxa"/>
+          </w:tcPr>
+          <w:p>
+            <w:r>
+              <w:t>In case there was not a single file within the MFF package that matched “Event_*.xml”, then an error would occur. This is now resolved.</w:t>
+            </w:r>
+          </w:p>
+        </w:tc>
+      </w:tr>
+    </w:tbl>
+    <w:p/>
+    <w:tbl>
+      <w:tblPr>
+        <w:tblStyle w:val="TableGrid"/>
+        <w:tblW w:w="0" w:type="auto"/>
+        <w:tblBorders>
+          <w:top w:val="none" w:sz="0" w:space="0" w:color="auto"/>
+          <w:left w:val="none" w:sz="0" w:space="0" w:color="auto"/>
+          <w:bottom w:val="none" w:sz="0" w:space="0" w:color="auto"/>
+          <w:right w:val="none" w:sz="0" w:space="0" w:color="auto"/>
+          <w:insideH w:val="none" w:sz="0" w:space="0" w:color="auto"/>
+          <w:insideV w:val="none" w:sz="0" w:space="0" w:color="auto"/>
+        </w:tblBorders>
+        <w:tblLayout w:type="fixed"/>
+        <w:tblCellMar>
+          <w:top w:w="57" w:type="dxa"/>
+          <w:left w:w="57" w:type="dxa"/>
+          <w:bottom w:w="57" w:type="dxa"/>
+          <w:right w:w="57" w:type="dxa"/>
+        </w:tblCellMar>
+        <w:tblLook w:val="04A0" w:firstRow="1" w:lastRow="0" w:firstColumn="1" w:lastColumn="0" w:noHBand="0" w:noVBand="1"/>
+      </w:tblPr>
+      <w:tblGrid>
+        <w:gridCol w:w="1129"/>
+        <w:gridCol w:w="426"/>
+        <w:gridCol w:w="7846"/>
+      </w:tblGrid>
+      <w:tr>
+        <w:tc>
+          <w:tcPr>
+            <w:tcW w:w="1129" w:type="dxa"/>
+            <w:tcBorders>
+              <w:top w:val="single" w:sz="4" w:space="0" w:color="4472C4" w:themeColor="accent1"/>
+              <w:left w:val="single" w:sz="4" w:space="0" w:color="4472C4" w:themeColor="accent1"/>
+              <w:bottom w:val="single" w:sz="4" w:space="0" w:color="4472C4" w:themeColor="accent1"/>
+              <w:right w:val="single" w:sz="4" w:space="0" w:color="4472C4" w:themeColor="accent1"/>
+            </w:tcBorders>
+            <w:shd w:val="clear" w:color="auto" w:fill="DEEAF6" w:themeFill="accent5" w:themeFillTint="33"/>
+          </w:tcPr>
+          <w:p>
+            <w:pPr>
+              <w:jc w:val="center"/>
+              <w:rPr>
+                <w:b/>
+                <w:bCs/>
+              </w:rPr>
+            </w:pPr>
+            <w:r>
+              <w:rPr>
+                <w:b/>
+                <w:bCs/>
+                <w:color w:val="2F5496" w:themeColor="accent1" w:themeShade="BF"/>
+              </w:rPr>
+              <w:t>CHANGED</w:t>
+            </w:r>
+          </w:p>
+        </w:tc>
+        <w:tc>
+          <w:tcPr>
+            <w:tcW w:w="426" w:type="dxa"/>
+            <w:tcBorders>
+              <w:left w:val="single" w:sz="4" w:space="0" w:color="4472C4" w:themeColor="accent1"/>
+            </w:tcBorders>
+          </w:tcPr>
+          <w:p/>
+        </w:tc>
+        <w:tc>
+          <w:tcPr>
+            <w:tcW w:w="7846" w:type="dxa"/>
+          </w:tcPr>
+          <w:p>
+            <w:r>
+              <w:rPr>
+                <w:b/>
+                <w:bCs/>
+              </w:rPr>
+              <w:t>Importing Grael recordings</w:t>
+            </w:r>
+          </w:p>
+        </w:tc>
+      </w:tr>
+      <w:tr>
+        <w:tc>
+          <w:tcPr>
+            <w:tcW w:w="1555" w:type="dxa"/>
+            <w:gridSpan w:val="2"/>
+            <w:shd w:val="clear" w:color="auto" w:fill="auto"/>
+          </w:tcPr>
+          <w:p>
+            <w:pPr>
+              <w:pStyle w:val="Caption"/>
+              <w:rPr>
+                <w:sz w:val="14"/>
+                <w:szCs w:val="14"/>
+              </w:rPr>
+            </w:pPr>
+            <w:r>
+              <w:rPr>
+                <w:sz w:val="14"/>
+                <w:szCs w:val="14"/>
+              </w:rPr>
+              <w:t>Version 2.</w:t>
+            </w:r>
+            <w:r>
+              <w:rPr>
+                <w:sz w:val="14"/>
+                <w:szCs w:val="14"/>
+              </w:rPr>
+              <w:t>2</w:t>
+            </w:r>
+            <w:r>
+              <w:rPr>
+                <w:sz w:val="14"/>
+                <w:szCs w:val="14"/>
+              </w:rPr>
+              <w:t>.0</w:t>
+            </w:r>
+          </w:p>
+          <w:p>
+            <w:pPr>
+              <w:pStyle w:val="Caption"/>
+              <w:rPr>
+                <w:sz w:val="14"/>
+                <w:szCs w:val="14"/>
+              </w:rPr>
+            </w:pPr>
+            <w:r>
+              <w:rPr>
+                <w:sz w:val="14"/>
+                <w:szCs w:val="14"/>
+              </w:rPr>
+              <w:t>ID #0020</w:t>
+            </w:r>
+            <w:r>
+              <w:rPr>
+                <w:sz w:val="14"/>
+                <w:szCs w:val="14"/>
+              </w:rPr>
+              <w:br/>
+              <w:t>11 Aug 2023</w:t>
+            </w:r>
+          </w:p>
+        </w:tc>
+        <w:tc>
+          <w:tcPr>
+            <w:tcW w:w="7846" w:type="dxa"/>
+          </w:tcPr>
+          <w:p>
+            <w:r>
+              <w:t>Importing Grael recordings now use the ‘edf2fieldtrip’ function. The Matlab ‘edfread’ function resulted in an error while reading EDFs exported from Grael Compumedics. The EDF is assumed to be referenced to one common reference channel. The EEG channel labels must be in 10-20 nomenclature and the following physiology channels must be labelled exactly as ‘E1’, ‘E2’, ‘ECG’, ‘Chin 1’, ‘Chin 2’, ‘Leg/L’, ‘Leg/R’, ‘Snore’, ‘Nasal Pressure’, ‘Therm’, ‘Thor’, ‘Abdo’, ‘SpO2’, and ‘Pulse’, otherwise the physiology channel will not be imported.</w:t>
+            </w:r>
+          </w:p>
+        </w:tc>
+      </w:tr>
+    </w:tbl>
+    <w:p/>
+    <w:tbl>
+      <w:tblPr>
+        <w:tblStyle w:val="TableGrid"/>
+        <w:tblW w:w="0" w:type="auto"/>
+        <w:tblBorders>
+          <w:top w:val="none" w:sz="0" w:space="0" w:color="auto"/>
+          <w:left w:val="none" w:sz="0" w:space="0" w:color="auto"/>
+          <w:bottom w:val="none" w:sz="0" w:space="0" w:color="auto"/>
+          <w:right w:val="none" w:sz="0" w:space="0" w:color="auto"/>
+          <w:insideH w:val="none" w:sz="0" w:space="0" w:color="auto"/>
+          <w:insideV w:val="none" w:sz="0" w:space="0" w:color="auto"/>
+        </w:tblBorders>
+        <w:tblLayout w:type="fixed"/>
+        <w:tblCellMar>
+          <w:top w:w="57" w:type="dxa"/>
+          <w:left w:w="57" w:type="dxa"/>
+          <w:bottom w:w="57" w:type="dxa"/>
+          <w:right w:w="57" w:type="dxa"/>
+        </w:tblCellMar>
+        <w:tblLook w:val="04A0" w:firstRow="1" w:lastRow="0" w:firstColumn="1" w:lastColumn="0" w:noHBand="0" w:noVBand="1"/>
+      </w:tblPr>
+      <w:tblGrid>
+        <w:gridCol w:w="704"/>
+        <w:gridCol w:w="851"/>
+        <w:gridCol w:w="7846"/>
+      </w:tblGrid>
+      <w:tr>
+        <w:tc>
+          <w:tcPr>
+            <w:tcW w:w="704" w:type="dxa"/>
+            <w:tcBorders>
+              <w:top w:val="single" w:sz="4" w:space="0" w:color="4472C4" w:themeColor="accent1"/>
+              <w:left w:val="single" w:sz="4" w:space="0" w:color="4472C4" w:themeColor="accent1"/>
+              <w:bottom w:val="single" w:sz="4" w:space="0" w:color="4472C4" w:themeColor="accent1"/>
+              <w:right w:val="single" w:sz="4" w:space="0" w:color="4472C4" w:themeColor="accent1"/>
+            </w:tcBorders>
+            <w:shd w:val="clear" w:color="auto" w:fill="DEEAF6" w:themeFill="accent5" w:themeFillTint="33"/>
+          </w:tcPr>
+          <w:p>
+            <w:pPr>
+              <w:jc w:val="center"/>
+              <w:rPr>
+                <w:b/>
+                <w:bCs/>
+              </w:rPr>
+            </w:pPr>
+            <w:r>
+              <w:rPr>
+                <w:b/>
+                <w:bCs/>
+                <w:color w:val="2F5496" w:themeColor="accent1" w:themeShade="BF"/>
+              </w:rPr>
+              <w:t>FIXED</w:t>
+            </w:r>
+          </w:p>
+        </w:tc>
+        <w:tc>
+          <w:tcPr>
+            <w:tcW w:w="851" w:type="dxa"/>
+            <w:tcBorders>
+              <w:left w:val="single" w:sz="4" w:space="0" w:color="4472C4" w:themeColor="accent1"/>
+            </w:tcBorders>
+          </w:tcPr>
+          <w:p/>
+        </w:tc>
+        <w:tc>
+          <w:tcPr>
+            <w:tcW w:w="7846" w:type="dxa"/>
+          </w:tcPr>
+          <w:p>
+            <w:pPr>
+              <w:rPr>
+                <w:b/>
+                <w:bCs/>
+              </w:rPr>
+            </w:pPr>
+            <w:r>
+              <w:rPr>
+                <w:b/>
+                <w:bCs/>
+              </w:rPr>
+              <w:t>Error related to binary representation of small floating-point numbers in channel locations</w:t>
+            </w:r>
+          </w:p>
+        </w:tc>
+      </w:tr>
+      <w:tr>
+        <w:tc>
+          <w:tcPr>
+            <w:tcW w:w="1555" w:type="dxa"/>
+            <w:gridSpan w:val="2"/>
+            <w:shd w:val="clear" w:color="auto" w:fill="auto"/>
+          </w:tcPr>
+          <w:p>
+            <w:pPr>
+              <w:pStyle w:val="Caption"/>
+              <w:rPr>
+                <w:sz w:val="14"/>
+                <w:szCs w:val="14"/>
+              </w:rPr>
+            </w:pPr>
+            <w:r>
+              <w:rPr>
+                <w:sz w:val="14"/>
+                <w:szCs w:val="14"/>
+              </w:rPr>
+              <w:t>Version 2.</w:t>
+            </w:r>
+            <w:r>
+              <w:rPr>
+                <w:sz w:val="14"/>
+                <w:szCs w:val="14"/>
+              </w:rPr>
+              <w:t>2</w:t>
+            </w:r>
+            <w:r>
+              <w:rPr>
+                <w:sz w:val="14"/>
+                <w:szCs w:val="14"/>
+              </w:rPr>
+              <w:t>.0</w:t>
+            </w:r>
+            <w:r>
+              <w:rPr>
+                <w:sz w:val="14"/>
+                <w:szCs w:val="14"/>
+              </w:rPr>
+              <w:br/>
+            </w:r>
+            <w:r>
+              <w:rPr>
+                <w:sz w:val="14"/>
+                <w:szCs w:val="14"/>
+              </w:rPr>
+              <w:t>ID #00</w:t>
+            </w:r>
+            <w:r>
+              <w:rPr>
+                <w:sz w:val="14"/>
+                <w:szCs w:val="14"/>
+              </w:rPr>
+              <w:t>19</w:t>
+            </w:r>
+            <w:r>
+              <w:rPr>
+                <w:sz w:val="14"/>
+                <w:szCs w:val="14"/>
+              </w:rPr>
+              <w:br/>
+              <w:t>19 Jun 2023</w:t>
+            </w:r>
+          </w:p>
+        </w:tc>
+        <w:tc>
+          <w:tcPr>
+            <w:tcW w:w="7846" w:type="dxa"/>
+          </w:tcPr>
+          <w:p>
+            <w:r>
+              <w:t xml:space="preserve">Due to tiny differences in binary representations of floating-point numbers, the paired differences of channel locations between good and bad channels were not always solvable, which resulted in an error. </w:t>
+            </w:r>
+            <w:r>
+              <w:t>When the interpolation results in an error, the channel locations are rounded to 3 significant digits and the interpolation is run again, and the original channel locations are placed back into the data structure.</w:t>
+            </w:r>
+          </w:p>
+        </w:tc>
+      </w:tr>
+    </w:tbl>
+    <w:p/>
+    <w:tbl>
+      <w:tblPr>
+        <w:tblStyle w:val="TableGrid"/>
+        <w:tblW w:w="0" w:type="auto"/>
+        <w:tblBorders>
+          <w:top w:val="none" w:sz="0" w:space="0" w:color="auto"/>
+          <w:left w:val="none" w:sz="0" w:space="0" w:color="auto"/>
+          <w:bottom w:val="none" w:sz="0" w:space="0" w:color="auto"/>
+          <w:right w:val="none" w:sz="0" w:space="0" w:color="auto"/>
+          <w:insideH w:val="none" w:sz="0" w:space="0" w:color="auto"/>
+          <w:insideV w:val="none" w:sz="0" w:space="0" w:color="auto"/>
+        </w:tblBorders>
+        <w:tblLayout w:type="fixed"/>
+        <w:tblCellMar>
+          <w:top w:w="57" w:type="dxa"/>
+          <w:left w:w="57" w:type="dxa"/>
+          <w:bottom w:w="57" w:type="dxa"/>
+          <w:right w:w="57" w:type="dxa"/>
+        </w:tblCellMar>
+        <w:tblLook w:val="04A0" w:firstRow="1" w:lastRow="0" w:firstColumn="1" w:lastColumn="0" w:noHBand="0" w:noVBand="1"/>
+      </w:tblPr>
+      <w:tblGrid>
+        <w:gridCol w:w="704"/>
+        <w:gridCol w:w="851"/>
+        <w:gridCol w:w="7846"/>
+      </w:tblGrid>
+      <w:tr>
+        <w:tc>
+          <w:tcPr>
+            <w:tcW w:w="704" w:type="dxa"/>
+            <w:tcBorders>
+              <w:top w:val="single" w:sz="4" w:space="0" w:color="4472C4" w:themeColor="accent1"/>
+              <w:left w:val="single" w:sz="4" w:space="0" w:color="4472C4" w:themeColor="accent1"/>
+              <w:bottom w:val="single" w:sz="4" w:space="0" w:color="4472C4" w:themeColor="accent1"/>
+              <w:right w:val="single" w:sz="4" w:space="0" w:color="4472C4" w:themeColor="accent1"/>
+            </w:tcBorders>
+            <w:shd w:val="clear" w:color="auto" w:fill="DEEAF6" w:themeFill="accent5" w:themeFillTint="33"/>
+          </w:tcPr>
+          <w:p>
+            <w:pPr>
+              <w:jc w:val="center"/>
+              <w:rPr>
+                <w:b/>
+                <w:bCs/>
+              </w:rPr>
+            </w:pPr>
+            <w:r>
+              <w:rPr>
+                <w:b/>
+                <w:bCs/>
+                <w:color w:val="2F5496" w:themeColor="accent1" w:themeShade="BF"/>
+              </w:rPr>
+              <w:t>FIXED</w:t>
+            </w:r>
+          </w:p>
+        </w:tc>
+        <w:tc>
+          <w:tcPr>
+            <w:tcW w:w="851" w:type="dxa"/>
+            <w:tcBorders>
+              <w:left w:val="single" w:sz="4" w:space="0" w:color="4472C4" w:themeColor="accent1"/>
+            </w:tcBorders>
+          </w:tcPr>
+          <w:p/>
+        </w:tc>
+        <w:tc>
+          <w:tcPr>
+            <w:tcW w:w="7846" w:type="dxa"/>
+          </w:tcPr>
+          <w:p>
+            <w:pPr>
+              <w:rPr>
+                <w:b/>
+                <w:bCs/>
+              </w:rPr>
+            </w:pPr>
+            <w:r>
+              <w:rPr>
+                <w:b/>
+                <w:bCs/>
+              </w:rPr>
+              <w:t>Error when showing warning messages</w:t>
+            </w:r>
+          </w:p>
+        </w:tc>
+      </w:tr>
+      <w:tr>
+        <w:tc>
+          <w:tcPr>
+            <w:tcW w:w="1555" w:type="dxa"/>
+            <w:gridSpan w:val="2"/>
+            <w:shd w:val="clear" w:color="auto" w:fill="auto"/>
+          </w:tcPr>
+          <w:p>
+            <w:pPr>
+              <w:pStyle w:val="Caption"/>
+              <w:rPr>
+                <w:sz w:val="14"/>
+                <w:szCs w:val="14"/>
+              </w:rPr>
+            </w:pPr>
+            <w:r>
+              <w:rPr>
+                <w:sz w:val="14"/>
+                <w:szCs w:val="14"/>
+              </w:rPr>
+              <w:t>Version 2.</w:t>
+            </w:r>
+            <w:r>
+              <w:rPr>
+                <w:sz w:val="14"/>
+                <w:szCs w:val="14"/>
+              </w:rPr>
+              <w:t>2</w:t>
+            </w:r>
+            <w:r>
+              <w:rPr>
+                <w:sz w:val="14"/>
+                <w:szCs w:val="14"/>
+              </w:rPr>
+              <w:t>.0</w:t>
+            </w:r>
+            <w:r>
+              <w:rPr>
+                <w:sz w:val="14"/>
+                <w:szCs w:val="14"/>
+              </w:rPr>
+              <w:br/>
+            </w:r>
+            <w:r>
+              <w:rPr>
+                <w:sz w:val="14"/>
+                <w:szCs w:val="14"/>
+              </w:rPr>
+              <w:t>ID #00</w:t>
+            </w:r>
+            <w:r>
+              <w:rPr>
+                <w:sz w:val="14"/>
+                <w:szCs w:val="14"/>
+              </w:rPr>
+              <w:t>18</w:t>
+            </w:r>
+            <w:r>
+              <w:rPr>
+                <w:sz w:val="14"/>
+                <w:szCs w:val="14"/>
+              </w:rPr>
+              <w:br/>
+              <w:t>11 May 2023</w:t>
+            </w:r>
+          </w:p>
+        </w:tc>
+        <w:tc>
+          <w:tcPr>
+            <w:tcW w:w="7846" w:type="dxa"/>
+          </w:tcPr>
+          <w:p>
+            <w:r>
+              <w:t>In some edge-cases the warning messages were nested within cell-arrays, which resulted in an error when displaying them in the ‘ShowError’ app. This should now be resolved.</w:t>
+            </w:r>
+          </w:p>
+        </w:tc>
+      </w:tr>
+    </w:tbl>
+    <w:p/>
+    <w:tbl>
+      <w:tblPr>
+        <w:tblStyle w:val="TableGrid"/>
+        <w:tblW w:w="0" w:type="auto"/>
+        <w:tblBorders>
+          <w:top w:val="none" w:sz="0" w:space="0" w:color="auto"/>
+          <w:left w:val="none" w:sz="0" w:space="0" w:color="auto"/>
+          <w:bottom w:val="none" w:sz="0" w:space="0" w:color="auto"/>
+          <w:right w:val="none" w:sz="0" w:space="0" w:color="auto"/>
+          <w:insideH w:val="none" w:sz="0" w:space="0" w:color="auto"/>
+          <w:insideV w:val="none" w:sz="0" w:space="0" w:color="auto"/>
+        </w:tblBorders>
+        <w:tblLayout w:type="fixed"/>
+        <w:tblCellMar>
+          <w:top w:w="57" w:type="dxa"/>
+          <w:left w:w="57" w:type="dxa"/>
+          <w:bottom w:w="57" w:type="dxa"/>
+          <w:right w:w="57" w:type="dxa"/>
+        </w:tblCellMar>
+        <w:tblLook w:val="04A0" w:firstRow="1" w:lastRow="0" w:firstColumn="1" w:lastColumn="0" w:noHBand="0" w:noVBand="1"/>
+      </w:tblPr>
+      <w:tblGrid>
+        <w:gridCol w:w="704"/>
+        <w:gridCol w:w="851"/>
+        <w:gridCol w:w="7846"/>
+      </w:tblGrid>
+      <w:tr>
+        <w:tc>
+          <w:tcPr>
+            <w:tcW w:w="704" w:type="dxa"/>
+            <w:tcBorders>
+              <w:top w:val="single" w:sz="4" w:space="0" w:color="4472C4" w:themeColor="accent1"/>
+              <w:left w:val="single" w:sz="4" w:space="0" w:color="4472C4" w:themeColor="accent1"/>
+              <w:bottom w:val="single" w:sz="4" w:space="0" w:color="4472C4" w:themeColor="accent1"/>
+              <w:right w:val="single" w:sz="4" w:space="0" w:color="4472C4" w:themeColor="accent1"/>
+            </w:tcBorders>
+            <w:shd w:val="clear" w:color="auto" w:fill="DEEAF6" w:themeFill="accent5" w:themeFillTint="33"/>
+          </w:tcPr>
+          <w:p>
+            <w:pPr>
+              <w:jc w:val="center"/>
+              <w:rPr>
+                <w:b/>
+                <w:bCs/>
+              </w:rPr>
+            </w:pPr>
+            <w:r>
+              <w:rPr>
+                <w:b/>
+                <w:bCs/>
+                <w:color w:val="2F5496" w:themeColor="accent1" w:themeShade="BF"/>
+              </w:rPr>
+              <w:t>FIXED</w:t>
+            </w:r>
+          </w:p>
+        </w:tc>
+        <w:tc>
+          <w:tcPr>
+            <w:tcW w:w="851" w:type="dxa"/>
+            <w:tcBorders>
+              <w:left w:val="single" w:sz="4" w:space="0" w:color="4472C4" w:themeColor="accent1"/>
+            </w:tcBorders>
+          </w:tcPr>
+          <w:p/>
+        </w:tc>
+        <w:tc>
+          <w:tcPr>
+            <w:tcW w:w="7846" w:type="dxa"/>
+          </w:tcPr>
+          <w:p>
+            <w:pPr>
+              <w:rPr>
+                <w:b/>
+                <w:bCs/>
+              </w:rPr>
+            </w:pPr>
+            <w:r>
+              <w:rPr>
+                <w:b/>
+                <w:bCs/>
+              </w:rPr>
+              <w:t xml:space="preserve">Event duration </w:t>
+            </w:r>
+            <w:r>
+              <w:rPr>
+                <w:b/>
+                <w:bCs/>
+              </w:rPr>
+              <w:t>‘</w:t>
+            </w:r>
+            <w:r>
+              <w:rPr>
+                <w:b/>
+                <w:bCs/>
+              </w:rPr>
+              <w:t>NaN</w:t>
+            </w:r>
+            <w:r>
+              <w:rPr>
+                <w:b/>
+                <w:bCs/>
+              </w:rPr>
+              <w:t>’</w:t>
+            </w:r>
+            <w:r>
+              <w:rPr>
+                <w:b/>
+                <w:bCs/>
+              </w:rPr>
+              <w:t xml:space="preserve"> values overwritten as zero</w:t>
+            </w:r>
+          </w:p>
+        </w:tc>
+      </w:tr>
+      <w:tr>
+        <w:tc>
+          <w:tcPr>
+            <w:tcW w:w="1555" w:type="dxa"/>
+            <w:gridSpan w:val="2"/>
+            <w:shd w:val="clear" w:color="auto" w:fill="auto"/>
+          </w:tcPr>
+          <w:p>
+            <w:pPr>
+              <w:pStyle w:val="Caption"/>
+              <w:rPr>
+                <w:sz w:val="14"/>
+                <w:szCs w:val="14"/>
+              </w:rPr>
+            </w:pPr>
+            <w:r>
+              <w:rPr>
+                <w:sz w:val="14"/>
+                <w:szCs w:val="14"/>
+              </w:rPr>
+              <w:t>Version 2.</w:t>
+            </w:r>
+            <w:r>
+              <w:rPr>
+                <w:sz w:val="14"/>
+                <w:szCs w:val="14"/>
+              </w:rPr>
+              <w:t>2</w:t>
+            </w:r>
+            <w:r>
+              <w:rPr>
+                <w:sz w:val="14"/>
+                <w:szCs w:val="14"/>
+              </w:rPr>
+              <w:t>.0</w:t>
+            </w:r>
+            <w:r>
+              <w:rPr>
+                <w:sz w:val="14"/>
+                <w:szCs w:val="14"/>
+              </w:rPr>
+              <w:br/>
+            </w:r>
+            <w:r>
+              <w:rPr>
+                <w:sz w:val="14"/>
+                <w:szCs w:val="14"/>
+              </w:rPr>
+              <w:t>ID #00</w:t>
+            </w:r>
+            <w:r>
+              <w:rPr>
+                <w:sz w:val="14"/>
+                <w:szCs w:val="14"/>
+              </w:rPr>
+              <w:t>17</w:t>
+            </w:r>
+            <w:r>
+              <w:rPr>
+                <w:sz w:val="14"/>
+                <w:szCs w:val="14"/>
+              </w:rPr>
+              <w:br/>
+              <w:t>1</w:t>
+            </w:r>
+            <w:r>
+              <w:rPr>
+                <w:sz w:val="14"/>
+                <w:szCs w:val="14"/>
+              </w:rPr>
+              <w:t>1</w:t>
+            </w:r>
+            <w:r>
+              <w:rPr>
+                <w:sz w:val="14"/>
+                <w:szCs w:val="14"/>
+              </w:rPr>
+              <w:t xml:space="preserve"> May 2023</w:t>
+            </w:r>
+          </w:p>
+        </w:tc>
+        <w:tc>
+          <w:tcPr>
+            <w:tcW w:w="7846" w:type="dxa"/>
+          </w:tcPr>
+          <w:p>
+            <w:r>
+              <w:t>The duration value of events can no longer be NaN’s, they are overwritten as zero.</w:t>
+            </w:r>
+          </w:p>
+        </w:tc>
+      </w:tr>
+    </w:tbl>
+    <w:p/>
+    <w:tbl>
+      <w:tblPr>
+        <w:tblStyle w:val="TableGrid"/>
+        <w:tblW w:w="0" w:type="auto"/>
+        <w:tblBorders>
+          <w:top w:val="none" w:sz="0" w:space="0" w:color="auto"/>
+          <w:left w:val="none" w:sz="0" w:space="0" w:color="auto"/>
+          <w:bottom w:val="none" w:sz="0" w:space="0" w:color="auto"/>
+          <w:right w:val="none" w:sz="0" w:space="0" w:color="auto"/>
+          <w:insideH w:val="none" w:sz="0" w:space="0" w:color="auto"/>
+          <w:insideV w:val="none" w:sz="0" w:space="0" w:color="auto"/>
+        </w:tblBorders>
+        <w:tblLayout w:type="fixed"/>
+        <w:tblCellMar>
+          <w:top w:w="57" w:type="dxa"/>
+          <w:left w:w="57" w:type="dxa"/>
+          <w:bottom w:w="57" w:type="dxa"/>
+          <w:right w:w="57" w:type="dxa"/>
+        </w:tblCellMar>
+        <w:tblLook w:val="04A0" w:firstRow="1" w:lastRow="0" w:firstColumn="1" w:lastColumn="0" w:noHBand="0" w:noVBand="1"/>
+      </w:tblPr>
+      <w:tblGrid>
+        <w:gridCol w:w="846"/>
+        <w:gridCol w:w="709"/>
+        <w:gridCol w:w="7846"/>
+      </w:tblGrid>
+      <w:tr>
+        <w:tc>
+          <w:tcPr>
+            <w:tcW w:w="846" w:type="dxa"/>
+            <w:tcBorders>
+              <w:top w:val="single" w:sz="4" w:space="0" w:color="70AD47" w:themeColor="accent6"/>
+              <w:left w:val="single" w:sz="4" w:space="0" w:color="70AD47" w:themeColor="accent6"/>
+              <w:bottom w:val="single" w:sz="4" w:space="0" w:color="70AD47" w:themeColor="accent6"/>
+              <w:right w:val="single" w:sz="4" w:space="0" w:color="70AD47" w:themeColor="accent6"/>
+            </w:tcBorders>
+            <w:shd w:val="clear" w:color="auto" w:fill="E2EFD9" w:themeFill="accent6" w:themeFillTint="33"/>
+          </w:tcPr>
+          <w:p>
+            <w:pPr>
+              <w:jc w:val="center"/>
+              <w:rPr>
+                <w:b/>
+                <w:bCs/>
+              </w:rPr>
+            </w:pPr>
+            <w:r>
+              <w:rPr>
+                <w:b/>
+                <w:bCs/>
+                <w:color w:val="538135" w:themeColor="accent6" w:themeShade="BF"/>
+              </w:rPr>
+              <w:t>ADDED</w:t>
+            </w:r>
+          </w:p>
+        </w:tc>
+        <w:tc>
+          <w:tcPr>
+            <w:tcW w:w="709" w:type="dxa"/>
+            <w:tcBorders>
+              <w:left w:val="single" w:sz="4" w:space="0" w:color="70AD47" w:themeColor="accent6"/>
+            </w:tcBorders>
+          </w:tcPr>
+          <w:p/>
+        </w:tc>
+        <w:tc>
+          <w:tcPr>
+            <w:tcW w:w="7846" w:type="dxa"/>
+          </w:tcPr>
+          <w:p>
+            <w:pPr>
+              <w:rPr>
+                <w:b/>
+                <w:bCs/>
+              </w:rPr>
+            </w:pPr>
+            <w:r>
+              <w:rPr>
+                <w:b/>
+                <w:bCs/>
+              </w:rPr>
+              <w:t>Several small changes to group-level analysis</w:t>
+            </w:r>
+          </w:p>
+        </w:tc>
+      </w:tr>
+      <w:tr>
+        <w:tc>
+          <w:tcPr>
+            <w:tcW w:w="1555" w:type="dxa"/>
+            <w:gridSpan w:val="2"/>
+            <w:shd w:val="clear" w:color="auto" w:fill="auto"/>
+          </w:tcPr>
+          <w:p>
+            <w:pPr>
+              <w:pStyle w:val="Caption"/>
+              <w:rPr>
+                <w:sz w:val="14"/>
+                <w:szCs w:val="14"/>
+              </w:rPr>
+            </w:pPr>
+            <w:r>
+              <w:rPr>
+                <w:sz w:val="14"/>
+                <w:szCs w:val="14"/>
+              </w:rPr>
+              <w:t>Version 2.</w:t>
+            </w:r>
+            <w:r>
+              <w:rPr>
+                <w:sz w:val="14"/>
+                <w:szCs w:val="14"/>
+              </w:rPr>
+              <w:t>2</w:t>
+            </w:r>
+            <w:r>
+              <w:rPr>
+                <w:sz w:val="14"/>
+                <w:szCs w:val="14"/>
+              </w:rPr>
+              <w:t>.0</w:t>
+            </w:r>
+            <w:r>
+              <w:rPr>
+                <w:sz w:val="14"/>
+                <w:szCs w:val="14"/>
+              </w:rPr>
+              <w:br/>
+              <w:t>19 Jun 2023</w:t>
+            </w:r>
+          </w:p>
+        </w:tc>
+        <w:tc>
+          <w:tcPr>
+            <w:tcW w:w="7846" w:type="dxa"/>
+          </w:tcPr>
+          <w:p>
+            <w:r>
+              <w:t xml:space="preserve">General linear models can now be specified without an intercept. The TFCE Connectivity parameter is implemented and the value hard-coded to ‘6’. And the function ‘get_pvalue’ now </w:t>
+            </w:r>
+            <w:r>
+              <w:lastRenderedPageBreak/>
+              <w:t>reads ‘V’ statistics (when more than one exchangeability blocks or variance groups are used).</w:t>
+            </w:r>
+          </w:p>
+        </w:tc>
+      </w:tr>
+    </w:tbl>
+    <w:p/>
+    <w:tbl>
+      <w:tblPr>
+        <w:tblStyle w:val="TableGrid"/>
+        <w:tblW w:w="0" w:type="auto"/>
+        <w:tblBorders>
+          <w:top w:val="none" w:sz="0" w:space="0" w:color="auto"/>
+          <w:left w:val="none" w:sz="0" w:space="0" w:color="auto"/>
+          <w:bottom w:val="none" w:sz="0" w:space="0" w:color="auto"/>
+          <w:right w:val="none" w:sz="0" w:space="0" w:color="auto"/>
+          <w:insideH w:val="none" w:sz="0" w:space="0" w:color="auto"/>
+          <w:insideV w:val="none" w:sz="0" w:space="0" w:color="auto"/>
+        </w:tblBorders>
+        <w:tblLayout w:type="fixed"/>
+        <w:tblCellMar>
+          <w:top w:w="57" w:type="dxa"/>
+          <w:left w:w="57" w:type="dxa"/>
+          <w:bottom w:w="57" w:type="dxa"/>
+          <w:right w:w="57" w:type="dxa"/>
+        </w:tblCellMar>
+        <w:tblLook w:val="04A0" w:firstRow="1" w:lastRow="0" w:firstColumn="1" w:lastColumn="0" w:noHBand="0" w:noVBand="1"/>
+      </w:tblPr>
+      <w:tblGrid>
+        <w:gridCol w:w="846"/>
+        <w:gridCol w:w="709"/>
+        <w:gridCol w:w="7846"/>
+      </w:tblGrid>
+      <w:tr>
+        <w:tc>
+          <w:tcPr>
+            <w:tcW w:w="846" w:type="dxa"/>
+            <w:tcBorders>
+              <w:top w:val="single" w:sz="4" w:space="0" w:color="70AD47" w:themeColor="accent6"/>
+              <w:left w:val="single" w:sz="4" w:space="0" w:color="70AD47" w:themeColor="accent6"/>
+              <w:bottom w:val="single" w:sz="4" w:space="0" w:color="70AD47" w:themeColor="accent6"/>
+              <w:right w:val="single" w:sz="4" w:space="0" w:color="70AD47" w:themeColor="accent6"/>
+            </w:tcBorders>
+            <w:shd w:val="clear" w:color="auto" w:fill="E2EFD9" w:themeFill="accent6" w:themeFillTint="33"/>
+          </w:tcPr>
+          <w:p>
+            <w:pPr>
+              <w:jc w:val="center"/>
+              <w:rPr>
+                <w:b/>
+                <w:bCs/>
+              </w:rPr>
+            </w:pPr>
+            <w:r>
+              <w:rPr>
+                <w:b/>
+                <w:bCs/>
+                <w:color w:val="538135" w:themeColor="accent6" w:themeShade="BF"/>
+              </w:rPr>
+              <w:t>ADDED</w:t>
+            </w:r>
+          </w:p>
+        </w:tc>
+        <w:tc>
+          <w:tcPr>
+            <w:tcW w:w="709" w:type="dxa"/>
+            <w:tcBorders>
+              <w:left w:val="single" w:sz="4" w:space="0" w:color="70AD47" w:themeColor="accent6"/>
+            </w:tcBorders>
+          </w:tcPr>
+          <w:p/>
+        </w:tc>
+        <w:tc>
+          <w:tcPr>
+            <w:tcW w:w="7846" w:type="dxa"/>
+          </w:tcPr>
+          <w:p>
+            <w:pPr>
+              <w:rPr>
+                <w:b/>
+                <w:bCs/>
+              </w:rPr>
+            </w:pPr>
+            <w:r>
+              <w:rPr>
+                <w:b/>
+                <w:bCs/>
+              </w:rPr>
+              <w:t>The key-value pair session and run is now optional</w:t>
+            </w:r>
+          </w:p>
+        </w:tc>
+      </w:tr>
+      <w:tr>
+        <w:tc>
+          <w:tcPr>
+            <w:tcW w:w="1555" w:type="dxa"/>
+            <w:gridSpan w:val="2"/>
+            <w:shd w:val="clear" w:color="auto" w:fill="auto"/>
+          </w:tcPr>
+          <w:p>
+            <w:pPr>
+              <w:pStyle w:val="Caption"/>
+              <w:rPr>
+                <w:sz w:val="14"/>
+                <w:szCs w:val="14"/>
+              </w:rPr>
+            </w:pPr>
+            <w:r>
+              <w:rPr>
+                <w:sz w:val="14"/>
+                <w:szCs w:val="14"/>
+              </w:rPr>
+              <w:t>Version 2.</w:t>
+            </w:r>
+            <w:r>
+              <w:rPr>
+                <w:sz w:val="14"/>
+                <w:szCs w:val="14"/>
+              </w:rPr>
+              <w:t>2</w:t>
+            </w:r>
+            <w:r>
+              <w:rPr>
+                <w:sz w:val="14"/>
+                <w:szCs w:val="14"/>
+              </w:rPr>
+              <w:t>.0</w:t>
+            </w:r>
+            <w:r>
+              <w:rPr>
+                <w:sz w:val="14"/>
+                <w:szCs w:val="14"/>
+              </w:rPr>
+              <w:br/>
+              <w:t>19 Jun 2023</w:t>
+            </w:r>
+          </w:p>
+        </w:tc>
+        <w:tc>
+          <w:tcPr>
+            <w:tcW w:w="7846" w:type="dxa"/>
+          </w:tcPr>
+          <w:p>
+            <w:r>
+              <w:t>Users can now specify to include or exclude the ‘ses-‘ and ‘run-‘ key-value pairs in the recording filenames.</w:t>
+            </w:r>
+          </w:p>
+        </w:tc>
+      </w:tr>
+    </w:tbl>
+    <w:p/>
+    <w:tbl>
+      <w:tblPr>
+        <w:tblStyle w:val="TableGrid"/>
+        <w:tblW w:w="0" w:type="auto"/>
+        <w:tblBorders>
+          <w:top w:val="none" w:sz="0" w:space="0" w:color="auto"/>
+          <w:left w:val="none" w:sz="0" w:space="0" w:color="auto"/>
+          <w:bottom w:val="none" w:sz="0" w:space="0" w:color="auto"/>
+          <w:right w:val="none" w:sz="0" w:space="0" w:color="auto"/>
+          <w:insideH w:val="none" w:sz="0" w:space="0" w:color="auto"/>
+          <w:insideV w:val="none" w:sz="0" w:space="0" w:color="auto"/>
+        </w:tblBorders>
+        <w:tblLayout w:type="fixed"/>
+        <w:tblCellMar>
+          <w:top w:w="57" w:type="dxa"/>
+          <w:left w:w="57" w:type="dxa"/>
+          <w:bottom w:w="57" w:type="dxa"/>
+          <w:right w:w="57" w:type="dxa"/>
+        </w:tblCellMar>
+        <w:tblLook w:val="04A0" w:firstRow="1" w:lastRow="0" w:firstColumn="1" w:lastColumn="0" w:noHBand="0" w:noVBand="1"/>
+      </w:tblPr>
+      <w:tblGrid>
+        <w:gridCol w:w="846"/>
+        <w:gridCol w:w="709"/>
+        <w:gridCol w:w="7846"/>
+      </w:tblGrid>
+      <w:tr>
+        <w:tc>
+          <w:tcPr>
+            <w:tcW w:w="846" w:type="dxa"/>
+            <w:tcBorders>
+              <w:top w:val="single" w:sz="4" w:space="0" w:color="70AD47" w:themeColor="accent6"/>
+              <w:left w:val="single" w:sz="4" w:space="0" w:color="70AD47" w:themeColor="accent6"/>
+              <w:bottom w:val="single" w:sz="4" w:space="0" w:color="70AD47" w:themeColor="accent6"/>
+              <w:right w:val="single" w:sz="4" w:space="0" w:color="70AD47" w:themeColor="accent6"/>
+            </w:tcBorders>
+            <w:shd w:val="clear" w:color="auto" w:fill="E2EFD9" w:themeFill="accent6" w:themeFillTint="33"/>
+          </w:tcPr>
+          <w:p>
+            <w:pPr>
+              <w:jc w:val="center"/>
+              <w:rPr>
+                <w:b/>
+                <w:bCs/>
+              </w:rPr>
+            </w:pPr>
+            <w:r>
+              <w:rPr>
+                <w:b/>
+                <w:bCs/>
+                <w:color w:val="538135" w:themeColor="accent6" w:themeShade="BF"/>
+              </w:rPr>
+              <w:t>ADDED</w:t>
+            </w:r>
+          </w:p>
+        </w:tc>
+        <w:tc>
+          <w:tcPr>
+            <w:tcW w:w="709" w:type="dxa"/>
+            <w:tcBorders>
+              <w:left w:val="single" w:sz="4" w:space="0" w:color="70AD47" w:themeColor="accent6"/>
+            </w:tcBorders>
+          </w:tcPr>
+          <w:p/>
+        </w:tc>
+        <w:tc>
+          <w:tcPr>
+            <w:tcW w:w="7846" w:type="dxa"/>
+          </w:tcPr>
+          <w:p>
+            <w:pPr>
+              <w:rPr>
+                <w:b/>
+                <w:bCs/>
+              </w:rPr>
+            </w:pPr>
+            <w:r>
+              <w:rPr>
+                <w:b/>
+                <w:bCs/>
+              </w:rPr>
+              <w:t>Sign in and out</w:t>
+            </w:r>
+          </w:p>
+        </w:tc>
+      </w:tr>
+      <w:tr>
+        <w:tc>
+          <w:tcPr>
+            <w:tcW w:w="1555" w:type="dxa"/>
+            <w:gridSpan w:val="2"/>
+            <w:shd w:val="clear" w:color="auto" w:fill="auto"/>
+          </w:tcPr>
+          <w:p>
+            <w:pPr>
+              <w:pStyle w:val="Caption"/>
+              <w:rPr>
+                <w:sz w:val="14"/>
+                <w:szCs w:val="14"/>
+              </w:rPr>
+            </w:pPr>
+            <w:r>
+              <w:rPr>
+                <w:sz w:val="14"/>
+                <w:szCs w:val="14"/>
+              </w:rPr>
+              <w:t>Version 2.</w:t>
+            </w:r>
+            <w:r>
+              <w:rPr>
+                <w:sz w:val="14"/>
+                <w:szCs w:val="14"/>
+              </w:rPr>
+              <w:t>2</w:t>
+            </w:r>
+            <w:r>
+              <w:rPr>
+                <w:sz w:val="14"/>
+                <w:szCs w:val="14"/>
+              </w:rPr>
+              <w:t>.0</w:t>
+            </w:r>
+            <w:r>
+              <w:rPr>
+                <w:sz w:val="14"/>
+                <w:szCs w:val="14"/>
+              </w:rPr>
+              <w:br/>
+              <w:t>12 May 2023</w:t>
+            </w:r>
+          </w:p>
+        </w:tc>
+        <w:tc>
+          <w:tcPr>
+            <w:tcW w:w="7846" w:type="dxa"/>
+          </w:tcPr>
+          <w:p>
+            <w:r>
+              <w:t>User must now sign in and out using their name before anything can be done in the EEG processor.</w:t>
+            </w:r>
+          </w:p>
+        </w:tc>
+      </w:tr>
+    </w:tbl>
+    <w:p/>
+    <w:tbl>
+      <w:tblPr>
+        <w:tblStyle w:val="TableGrid"/>
+        <w:tblW w:w="0" w:type="auto"/>
+        <w:tblBorders>
+          <w:top w:val="none" w:sz="0" w:space="0" w:color="auto"/>
+          <w:left w:val="none" w:sz="0" w:space="0" w:color="auto"/>
+          <w:bottom w:val="none" w:sz="0" w:space="0" w:color="auto"/>
+          <w:right w:val="none" w:sz="0" w:space="0" w:color="auto"/>
+          <w:insideH w:val="none" w:sz="0" w:space="0" w:color="auto"/>
+          <w:insideV w:val="none" w:sz="0" w:space="0" w:color="auto"/>
+        </w:tblBorders>
+        <w:tblLayout w:type="fixed"/>
+        <w:tblCellMar>
+          <w:top w:w="57" w:type="dxa"/>
+          <w:left w:w="57" w:type="dxa"/>
+          <w:bottom w:w="57" w:type="dxa"/>
+          <w:right w:w="57" w:type="dxa"/>
+        </w:tblCellMar>
+        <w:tblLook w:val="04A0" w:firstRow="1" w:lastRow="0" w:firstColumn="1" w:lastColumn="0" w:noHBand="0" w:noVBand="1"/>
+      </w:tblPr>
+      <w:tblGrid>
+        <w:gridCol w:w="846"/>
+        <w:gridCol w:w="709"/>
+        <w:gridCol w:w="7846"/>
+      </w:tblGrid>
+      <w:tr>
+        <w:tc>
+          <w:tcPr>
+            <w:tcW w:w="846" w:type="dxa"/>
+            <w:tcBorders>
+              <w:top w:val="single" w:sz="4" w:space="0" w:color="70AD47" w:themeColor="accent6"/>
+              <w:left w:val="single" w:sz="4" w:space="0" w:color="70AD47" w:themeColor="accent6"/>
+              <w:bottom w:val="single" w:sz="4" w:space="0" w:color="70AD47" w:themeColor="accent6"/>
+              <w:right w:val="single" w:sz="4" w:space="0" w:color="70AD47" w:themeColor="accent6"/>
+            </w:tcBorders>
+            <w:shd w:val="clear" w:color="auto" w:fill="E2EFD9" w:themeFill="accent6" w:themeFillTint="33"/>
+          </w:tcPr>
+          <w:p>
+            <w:pPr>
+              <w:jc w:val="center"/>
+              <w:rPr>
+                <w:b/>
+                <w:bCs/>
+              </w:rPr>
+            </w:pPr>
+            <w:r>
+              <w:rPr>
+                <w:b/>
+                <w:bCs/>
+                <w:color w:val="538135" w:themeColor="accent6" w:themeShade="BF"/>
+              </w:rPr>
+              <w:t>ADDED</w:t>
+            </w:r>
+          </w:p>
+        </w:tc>
+        <w:tc>
+          <w:tcPr>
+            <w:tcW w:w="709" w:type="dxa"/>
+            <w:tcBorders>
+              <w:left w:val="single" w:sz="4" w:space="0" w:color="70AD47" w:themeColor="accent6"/>
+            </w:tcBorders>
+          </w:tcPr>
+          <w:p/>
+        </w:tc>
+        <w:tc>
+          <w:tcPr>
+            <w:tcW w:w="7846" w:type="dxa"/>
+          </w:tcPr>
+          <w:p>
+            <w:pPr>
+              <w:rPr>
+                <w:b/>
+                <w:bCs/>
+              </w:rPr>
+            </w:pPr>
+            <w:r>
+              <w:rPr>
+                <w:b/>
+                <w:bCs/>
+              </w:rPr>
+              <w:t>Concatenate dataset</w:t>
+            </w:r>
+            <w:r>
+              <w:rPr>
+                <w:b/>
+                <w:bCs/>
+              </w:rPr>
+              <w:t>s</w:t>
+            </w:r>
+          </w:p>
+        </w:tc>
+      </w:tr>
+      <w:tr>
+        <w:tc>
+          <w:tcPr>
+            <w:tcW w:w="1555" w:type="dxa"/>
+            <w:gridSpan w:val="2"/>
+            <w:shd w:val="clear" w:color="auto" w:fill="auto"/>
+          </w:tcPr>
+          <w:p>
+            <w:pPr>
+              <w:pStyle w:val="Caption"/>
+              <w:rPr>
+                <w:sz w:val="14"/>
+                <w:szCs w:val="14"/>
+              </w:rPr>
+            </w:pPr>
+            <w:r>
+              <w:rPr>
+                <w:sz w:val="14"/>
+                <w:szCs w:val="14"/>
+              </w:rPr>
+              <w:t>Version 2.</w:t>
+            </w:r>
+            <w:r>
+              <w:rPr>
+                <w:sz w:val="14"/>
+                <w:szCs w:val="14"/>
+              </w:rPr>
+              <w:t>2</w:t>
+            </w:r>
+            <w:r>
+              <w:rPr>
+                <w:sz w:val="14"/>
+                <w:szCs w:val="14"/>
+              </w:rPr>
+              <w:t>.0</w:t>
+            </w:r>
+            <w:r>
+              <w:rPr>
+                <w:sz w:val="14"/>
+                <w:szCs w:val="14"/>
+              </w:rPr>
+              <w:br/>
+              <w:t>11 May 2023</w:t>
+            </w:r>
+          </w:p>
+        </w:tc>
+        <w:tc>
+          <w:tcPr>
+            <w:tcW w:w="7846" w:type="dxa"/>
+          </w:tcPr>
+          <w:p>
+            <w:r>
+              <w:t xml:space="preserve">A new process has been added where you can concatenate datasets. You can check datasets across subjects because the app will automatically create separate processes for each subject. </w:t>
+            </w:r>
+            <w:r>
+              <w:t>For the ‘desc’ value, you can specify any key between angle brackets (‘&lt;’ and ‘&gt;’) to be inserted in the output filename. This string will be replaced by the value of that key from the first input file.</w:t>
+            </w:r>
+          </w:p>
+        </w:tc>
+      </w:tr>
+    </w:tbl>
+    <w:p/>
+    <w:tbl>
+      <w:tblPr>
+        <w:tblStyle w:val="TableGrid"/>
+        <w:tblW w:w="0" w:type="auto"/>
+        <w:tblBorders>
+          <w:top w:val="none" w:sz="0" w:space="0" w:color="auto"/>
+          <w:left w:val="none" w:sz="0" w:space="0" w:color="auto"/>
+          <w:bottom w:val="none" w:sz="0" w:space="0" w:color="auto"/>
+          <w:right w:val="none" w:sz="0" w:space="0" w:color="auto"/>
+          <w:insideH w:val="none" w:sz="0" w:space="0" w:color="auto"/>
+          <w:insideV w:val="none" w:sz="0" w:space="0" w:color="auto"/>
+        </w:tblBorders>
+        <w:tblLayout w:type="fixed"/>
+        <w:tblCellMar>
+          <w:top w:w="57" w:type="dxa"/>
+          <w:left w:w="57" w:type="dxa"/>
+          <w:bottom w:w="57" w:type="dxa"/>
+          <w:right w:w="57" w:type="dxa"/>
+        </w:tblCellMar>
+        <w:tblLook w:val="04A0" w:firstRow="1" w:lastRow="0" w:firstColumn="1" w:lastColumn="0" w:noHBand="0" w:noVBand="1"/>
+      </w:tblPr>
+      <w:tblGrid>
+        <w:gridCol w:w="846"/>
+        <w:gridCol w:w="709"/>
+        <w:gridCol w:w="7846"/>
+      </w:tblGrid>
+      <w:tr>
+        <w:tc>
+          <w:tcPr>
+            <w:tcW w:w="846" w:type="dxa"/>
+            <w:tcBorders>
+              <w:top w:val="single" w:sz="4" w:space="0" w:color="70AD47" w:themeColor="accent6"/>
+              <w:left w:val="single" w:sz="4" w:space="0" w:color="70AD47" w:themeColor="accent6"/>
+              <w:bottom w:val="single" w:sz="4" w:space="0" w:color="70AD47" w:themeColor="accent6"/>
+              <w:right w:val="single" w:sz="4" w:space="0" w:color="70AD47" w:themeColor="accent6"/>
+            </w:tcBorders>
+            <w:shd w:val="clear" w:color="auto" w:fill="E2EFD9" w:themeFill="accent6" w:themeFillTint="33"/>
+          </w:tcPr>
+          <w:p>
+            <w:pPr>
+              <w:jc w:val="center"/>
+              <w:rPr>
+                <w:b/>
+                <w:bCs/>
+              </w:rPr>
+            </w:pPr>
+            <w:r>
+              <w:rPr>
+                <w:b/>
+                <w:bCs/>
+                <w:color w:val="538135" w:themeColor="accent6" w:themeShade="BF"/>
+              </w:rPr>
+              <w:t>ADDED</w:t>
+            </w:r>
+          </w:p>
+        </w:tc>
+        <w:tc>
+          <w:tcPr>
+            <w:tcW w:w="709" w:type="dxa"/>
+            <w:tcBorders>
+              <w:left w:val="single" w:sz="4" w:space="0" w:color="70AD47" w:themeColor="accent6"/>
+            </w:tcBorders>
+          </w:tcPr>
+          <w:p/>
+        </w:tc>
+        <w:tc>
+          <w:tcPr>
+            <w:tcW w:w="7846" w:type="dxa"/>
+          </w:tcPr>
+          <w:p>
+            <w:pPr>
+              <w:rPr>
+                <w:b/>
+                <w:bCs/>
+              </w:rPr>
+            </w:pPr>
+            <w:r>
+              <w:rPr>
+                <w:b/>
+                <w:bCs/>
+              </w:rPr>
+              <w:t>Import external events for already imported recordings</w:t>
+            </w:r>
+          </w:p>
+        </w:tc>
+      </w:tr>
+      <w:tr>
+        <w:tc>
+          <w:tcPr>
+            <w:tcW w:w="1555" w:type="dxa"/>
+            <w:gridSpan w:val="2"/>
+            <w:shd w:val="clear" w:color="auto" w:fill="auto"/>
+          </w:tcPr>
+          <w:p>
+            <w:pPr>
+              <w:pStyle w:val="Caption"/>
+              <w:rPr>
+                <w:sz w:val="14"/>
+                <w:szCs w:val="14"/>
+              </w:rPr>
+            </w:pPr>
+            <w:r>
+              <w:rPr>
+                <w:sz w:val="14"/>
+                <w:szCs w:val="14"/>
+              </w:rPr>
+              <w:t>Version 2.</w:t>
+            </w:r>
+            <w:r>
+              <w:rPr>
+                <w:sz w:val="14"/>
+                <w:szCs w:val="14"/>
+              </w:rPr>
+              <w:t>2</w:t>
+            </w:r>
+            <w:r>
+              <w:rPr>
+                <w:sz w:val="14"/>
+                <w:szCs w:val="14"/>
+              </w:rPr>
+              <w:t>.0</w:t>
+            </w:r>
+            <w:r>
+              <w:rPr>
+                <w:sz w:val="14"/>
+                <w:szCs w:val="14"/>
+              </w:rPr>
+              <w:br/>
+              <w:t>11 May 2023</w:t>
+            </w:r>
+          </w:p>
+        </w:tc>
+        <w:tc>
+          <w:tcPr>
+            <w:tcW w:w="7846" w:type="dxa"/>
+          </w:tcPr>
+          <w:p>
+            <w:r>
+              <w:t>Up until now, you could only import events from external files when importing a new recording from a source file. Now you can select any file from the list</w:t>
+            </w:r>
+          </w:p>
+        </w:tc>
+      </w:tr>
+    </w:tbl>
+    <w:p/>
+    <w:tbl>
+      <w:tblPr>
+        <w:tblStyle w:val="TableGrid"/>
+        <w:tblW w:w="0" w:type="auto"/>
+        <w:tblBorders>
+          <w:top w:val="none" w:sz="0" w:space="0" w:color="auto"/>
+          <w:left w:val="none" w:sz="0" w:space="0" w:color="auto"/>
+          <w:bottom w:val="none" w:sz="0" w:space="0" w:color="auto"/>
+          <w:right w:val="none" w:sz="0" w:space="0" w:color="auto"/>
+          <w:insideH w:val="none" w:sz="0" w:space="0" w:color="auto"/>
+          <w:insideV w:val="none" w:sz="0" w:space="0" w:color="auto"/>
+        </w:tblBorders>
+        <w:tblLayout w:type="fixed"/>
+        <w:tblCellMar>
+          <w:top w:w="57" w:type="dxa"/>
+          <w:left w:w="57" w:type="dxa"/>
+          <w:bottom w:w="57" w:type="dxa"/>
+          <w:right w:w="57" w:type="dxa"/>
+        </w:tblCellMar>
+        <w:tblLook w:val="04A0" w:firstRow="1" w:lastRow="0" w:firstColumn="1" w:lastColumn="0" w:noHBand="0" w:noVBand="1"/>
+      </w:tblPr>
+      <w:tblGrid>
+        <w:gridCol w:w="846"/>
+        <w:gridCol w:w="709"/>
+        <w:gridCol w:w="7846"/>
+      </w:tblGrid>
+      <w:tr>
+        <w:tc>
+          <w:tcPr>
+            <w:tcW w:w="846" w:type="dxa"/>
+            <w:tcBorders>
+              <w:top w:val="single" w:sz="4" w:space="0" w:color="70AD47" w:themeColor="accent6"/>
+              <w:left w:val="single" w:sz="4" w:space="0" w:color="70AD47" w:themeColor="accent6"/>
+              <w:bottom w:val="single" w:sz="4" w:space="0" w:color="70AD47" w:themeColor="accent6"/>
+              <w:right w:val="single" w:sz="4" w:space="0" w:color="70AD47" w:themeColor="accent6"/>
+            </w:tcBorders>
+            <w:shd w:val="clear" w:color="auto" w:fill="E2EFD9" w:themeFill="accent6" w:themeFillTint="33"/>
+          </w:tcPr>
+          <w:p>
+            <w:pPr>
+              <w:jc w:val="center"/>
+              <w:rPr>
+                <w:b/>
+                <w:bCs/>
+              </w:rPr>
+            </w:pPr>
+            <w:r>
+              <w:rPr>
+                <w:b/>
+                <w:bCs/>
+                <w:color w:val="538135" w:themeColor="accent6" w:themeShade="BF"/>
+              </w:rPr>
+              <w:t>ADDED</w:t>
+            </w:r>
+          </w:p>
+        </w:tc>
+        <w:tc>
+          <w:tcPr>
+            <w:tcW w:w="709" w:type="dxa"/>
+            <w:tcBorders>
+              <w:left w:val="single" w:sz="4" w:space="0" w:color="70AD47" w:themeColor="accent6"/>
+            </w:tcBorders>
+          </w:tcPr>
+          <w:p/>
+        </w:tc>
+        <w:tc>
+          <w:tcPr>
+            <w:tcW w:w="7846" w:type="dxa"/>
+          </w:tcPr>
+          <w:p>
+            <w:pPr>
+              <w:rPr>
+                <w:b/>
+                <w:bCs/>
+              </w:rPr>
+            </w:pPr>
+            <w:r>
+              <w:rPr>
+                <w:b/>
+                <w:bCs/>
+              </w:rPr>
+              <w:t>Modify the ‘desc’ value of PSA output files</w:t>
+            </w:r>
+          </w:p>
+        </w:tc>
+      </w:tr>
+      <w:tr>
+        <w:tc>
+          <w:tcPr>
+            <w:tcW w:w="1555" w:type="dxa"/>
+            <w:gridSpan w:val="2"/>
+            <w:shd w:val="clear" w:color="auto" w:fill="auto"/>
+          </w:tcPr>
+          <w:p>
+            <w:pPr>
+              <w:pStyle w:val="Caption"/>
+              <w:rPr>
+                <w:sz w:val="14"/>
+                <w:szCs w:val="14"/>
+              </w:rPr>
+            </w:pPr>
+            <w:r>
+              <w:rPr>
+                <w:sz w:val="14"/>
+                <w:szCs w:val="14"/>
+              </w:rPr>
+              <w:t>Version 2.</w:t>
+            </w:r>
+            <w:r>
+              <w:rPr>
+                <w:sz w:val="14"/>
+                <w:szCs w:val="14"/>
+              </w:rPr>
+              <w:t>2</w:t>
+            </w:r>
+            <w:r>
+              <w:rPr>
+                <w:sz w:val="14"/>
+                <w:szCs w:val="14"/>
+              </w:rPr>
+              <w:t>.0</w:t>
+            </w:r>
+            <w:r>
+              <w:rPr>
+                <w:sz w:val="14"/>
+                <w:szCs w:val="14"/>
+              </w:rPr>
+              <w:br/>
+              <w:t>11 May 2023</w:t>
+            </w:r>
+          </w:p>
+        </w:tc>
+        <w:tc>
+          <w:tcPr>
+            <w:tcW w:w="7846" w:type="dxa"/>
+          </w:tcPr>
+          <w:p>
+            <w:r>
+              <w:t xml:space="preserve">An input field has been added to the Power Spectral Analysis settings window, where you can </w:t>
+            </w:r>
+            <w:r>
+              <w:t>change the ‘desc’ value of the output file. This may be relevant to specify when running multiple analyses on the same files with different PSA settings e.g., normalizing within or across frequency bands. You can specify any key between angle brackets (‘&lt;’ and ‘&gt;’) to be inserted in the ‘desc’ value of the output file. This string will be replaced by the value of that key from the input file.</w:t>
+            </w:r>
+          </w:p>
+        </w:tc>
+      </w:tr>
+    </w:tbl>
     <w:p/>
     <w:p>
       <w:pPr>
@@ -427,20 +2360,7 @@
                 <w:szCs w:val="14"/>
               </w:rPr>
               <w:br/>
-            </w:r>
-            <w:r>
-              <w:rPr>
-                <w:sz w:val="14"/>
-                <w:szCs w:val="14"/>
-              </w:rPr>
-              <w:t>6</w:t>
-            </w:r>
-            <w:r>
-              <w:rPr>
-                <w:sz w:val="14"/>
-                <w:szCs w:val="14"/>
-              </w:rPr>
-              <w:t xml:space="preserve"> Mar 2023</w:t>
+              <w:t>6 Mar 2023</w:t>
             </w:r>
           </w:p>
         </w:tc>
@@ -698,39 +2618,7 @@
                 <w:b/>
                 <w:bCs/>
               </w:rPr>
-              <w:t>Insert current value of a key in the ‘</w:t>
-            </w:r>
-            <w:proofErr w:type="spellStart"/>
-            <w:r>
-              <w:rPr>
-                <w:b/>
-                <w:bCs/>
-              </w:rPr>
-              <w:t>desc</w:t>
-            </w:r>
-            <w:proofErr w:type="spellEnd"/>
-            <w:r>
-              <w:rPr>
-                <w:b/>
-                <w:bCs/>
-              </w:rPr>
-              <w:t xml:space="preserve">’ value of </w:t>
-            </w:r>
-            <w:proofErr w:type="spellStart"/>
-            <w:r>
-              <w:rPr>
-                <w:b/>
-                <w:bCs/>
-              </w:rPr>
-              <w:t>preproc</w:t>
-            </w:r>
-            <w:proofErr w:type="spellEnd"/>
-            <w:r>
-              <w:rPr>
-                <w:b/>
-                <w:bCs/>
-              </w:rPr>
-              <w:t xml:space="preserve"> output files</w:t>
+              <w:t>Insert current value of a key in the ‘desc’ value of preproc output files</w:t>
             </w:r>
           </w:p>
         </w:tc>
@@ -787,23 +2675,7 @@
           </w:tcPr>
           <w:p>
             <w:r>
-              <w:t xml:space="preserve">Until now, in the ‘Select and </w:t>
-            </w:r>
-            <w:proofErr w:type="spellStart"/>
-            <w:r>
-              <w:t>Preprocess</w:t>
-            </w:r>
-            <w:proofErr w:type="spellEnd"/>
-            <w:r>
-              <w:t>’ GUI, there was no way to prepend or append the value of the ‘</w:t>
-            </w:r>
-            <w:proofErr w:type="spellStart"/>
-            <w:r>
-              <w:t>desc</w:t>
-            </w:r>
-            <w:proofErr w:type="spellEnd"/>
-            <w:r>
-              <w:t xml:space="preserve">’ key in the output filename. For example, </w:t>
+              <w:t xml:space="preserve">Until now, in the ‘Select and Preprocess’ GUI, there was no way to prepend or append the value of the ‘desc’ key in the output filename. For example, </w:t>
             </w:r>
             <w:r>
               <w:t>when</w:t>
@@ -818,87 +2690,43 @@
               <w:t xml:space="preserve"> 3 files with</w:t>
             </w:r>
             <w:r>
-              <w:t xml:space="preserve"> ‘</w:t>
-            </w:r>
-            <w:proofErr w:type="spellStart"/>
-            <w:r>
-              <w:t>desc</w:t>
-            </w:r>
-            <w:proofErr w:type="spellEnd"/>
-            <w:r>
-              <w:t>’ values of</w:t>
-            </w:r>
-            <w:r>
-              <w:t xml:space="preserve"> ‘eo1’, ‘</w:t>
-            </w:r>
-            <w:proofErr w:type="spellStart"/>
-            <w:r>
-              <w:t>ec</w:t>
-            </w:r>
-            <w:proofErr w:type="spellEnd"/>
-            <w:r>
-              <w:t>’, and ‘eo2’, the ‘</w:t>
-            </w:r>
-            <w:proofErr w:type="spellStart"/>
-            <w:r>
-              <w:t>desc</w:t>
-            </w:r>
-            <w:proofErr w:type="spellEnd"/>
-            <w:r>
-              <w:t>’ value</w:t>
+              <w:t xml:space="preserve"> ‘desc’ values of</w:t>
+            </w:r>
+            <w:r>
+              <w:t xml:space="preserve"> ‘eo1’, ‘ec’, and ‘eo2’, the ‘desc’ value</w:t>
             </w:r>
             <w:r>
               <w:t xml:space="preserve"> of the output files</w:t>
             </w:r>
             <w:r>
-              <w:t xml:space="preserve"> could only be specified as one new value resulting in an error as the 3 output files would have the same filename. Now the user can specify any key </w:t>
+              <w:t xml:space="preserve"> could only be specified as one new value</w:t>
+            </w:r>
+            <w:r>
+              <w:t>. This could</w:t>
+            </w:r>
+            <w:r>
+              <w:t xml:space="preserve"> result in an error as the 3 output files would have the same filename. Now the user can specify any key </w:t>
             </w:r>
             <w:r>
               <w:t xml:space="preserve">between angle brackets (‘&lt;’ and ‘&gt;’) </w:t>
             </w:r>
             <w:r>
-              <w:t>to be inserted in the ‘</w:t>
-            </w:r>
-            <w:proofErr w:type="spellStart"/>
-            <w:r>
-              <w:t>desc</w:t>
-            </w:r>
-            <w:proofErr w:type="spellEnd"/>
-            <w:r>
-              <w:t>’ value of the output file</w:t>
+              <w:t>to be inserted in the ‘desc’ value of the output file</w:t>
             </w:r>
             <w:r>
               <w:t>. This string will be replaced by the value of that key from the input file. For example,</w:t>
             </w:r>
             <w:r>
-              <w:t xml:space="preserve"> use ‘&lt;</w:t>
-            </w:r>
-            <w:proofErr w:type="spellStart"/>
-            <w:r>
-              <w:t>desc</w:t>
-            </w:r>
-            <w:proofErr w:type="spellEnd"/>
-            <w:r>
-              <w:t>&gt;</w:t>
-            </w:r>
-            <w:proofErr w:type="spellStart"/>
+              <w:t xml:space="preserve"> use ‘&lt;desc&gt;</w:t>
+            </w:r>
             <w:r>
               <w:t>preproc</w:t>
             </w:r>
-            <w:proofErr w:type="spellEnd"/>
             <w:r>
               <w:t xml:space="preserve">’, and the 3 output files will </w:t>
             </w:r>
             <w:r>
-              <w:t>have a ‘</w:t>
-            </w:r>
-            <w:proofErr w:type="spellStart"/>
-            <w:r>
-              <w:t>desc</w:t>
-            </w:r>
-            <w:proofErr w:type="spellEnd"/>
-            <w:r>
-              <w:t>’ value of</w:t>
+              <w:t>have a ‘desc’ value of</w:t>
             </w:r>
             <w:r>
               <w:t xml:space="preserve"> ‘eo1</w:t>
@@ -907,16 +2735,11 @@
               <w:t>preproc</w:t>
             </w:r>
             <w:r>
-              <w:t>’, ‘</w:t>
-            </w:r>
-            <w:proofErr w:type="spellStart"/>
-            <w:r>
-              <w:t>ec</w:t>
+              <w:t>’, ‘ec</w:t>
             </w:r>
             <w:r>
               <w:t>preproc</w:t>
             </w:r>
-            <w:proofErr w:type="spellEnd"/>
             <w:r>
               <w:t>’, and ‘eo2</w:t>
             </w:r>
@@ -1198,39 +3021,7 @@
                 <w:b/>
                 <w:bCs/>
               </w:rPr>
-              <w:t xml:space="preserve">Incorrect </w:t>
-            </w:r>
-            <w:proofErr w:type="spellStart"/>
-            <w:r>
-              <w:rPr>
-                <w:b/>
-                <w:bCs/>
-              </w:rPr>
-              <w:t>color</w:t>
-            </w:r>
-            <w:proofErr w:type="spellEnd"/>
-            <w:r>
-              <w:rPr>
-                <w:b/>
-                <w:bCs/>
-              </w:rPr>
-              <w:t xml:space="preserve"> of channel indicator in </w:t>
-            </w:r>
-            <w:proofErr w:type="spellStart"/>
-            <w:r>
-              <w:rPr>
-                <w:b/>
-                <w:bCs/>
-              </w:rPr>
-              <w:t>topoplot</w:t>
-            </w:r>
-            <w:proofErr w:type="spellEnd"/>
-            <w:r>
-              <w:rPr>
-                <w:b/>
-                <w:bCs/>
-              </w:rPr>
-              <w:t xml:space="preserve"> of group-level results</w:t>
+              <w:t>Incorrect color of channel indicator in topoplot of group-level results</w:t>
             </w:r>
           </w:p>
         </w:tc>
@@ -1376,7 +3167,6 @@
                 <w:bCs/>
                 <w:color w:val="538135" w:themeColor="accent6" w:themeShade="BF"/>
               </w:rPr>
-              <w:lastRenderedPageBreak/>
               <w:t>ADDED</w:t>
             </w:r>
           </w:p>
@@ -1668,23 +3458,7 @@
                 <w:b/>
                 <w:bCs/>
               </w:rPr>
-              <w:t xml:space="preserve">Importing </w:t>
-            </w:r>
-            <w:proofErr w:type="spellStart"/>
-            <w:r>
-              <w:rPr>
-                <w:b/>
-                <w:bCs/>
-              </w:rPr>
-              <w:t>Grael</w:t>
-            </w:r>
-            <w:proofErr w:type="spellEnd"/>
-            <w:r>
-              <w:rPr>
-                <w:b/>
-                <w:bCs/>
-              </w:rPr>
-              <w:t xml:space="preserve"> system EDF data</w:t>
+              <w:t>Importing Grael system EDF data</w:t>
             </w:r>
           </w:p>
         </w:tc>
@@ -1727,15 +3501,7 @@
           </w:tcPr>
           <w:p>
             <w:r>
-              <w:t xml:space="preserve">The import functions to import </w:t>
-            </w:r>
-            <w:proofErr w:type="spellStart"/>
-            <w:r>
-              <w:t>Grael</w:t>
-            </w:r>
-            <w:proofErr w:type="spellEnd"/>
-            <w:r>
-              <w:t xml:space="preserve"> system EDF datasets are now operational.</w:t>
+              <w:t>The import functions to import Grael system EDF datasets are now operational.</w:t>
             </w:r>
           </w:p>
         </w:tc>
@@ -1823,23 +3589,7 @@
                 <w:b/>
                 <w:bCs/>
               </w:rPr>
-              <w:t xml:space="preserve">Importing </w:t>
-            </w:r>
-            <w:proofErr w:type="spellStart"/>
-            <w:r>
-              <w:rPr>
-                <w:b/>
-                <w:bCs/>
-              </w:rPr>
-              <w:t>Compumedics</w:t>
-            </w:r>
-            <w:proofErr w:type="spellEnd"/>
-            <w:r>
-              <w:rPr>
-                <w:b/>
-                <w:bCs/>
-              </w:rPr>
-              <w:t xml:space="preserve"> 257 system EDF data</w:t>
+              <w:t>Importing Compumedics 257 system EDF data</w:t>
             </w:r>
           </w:p>
         </w:tc>
@@ -1882,15 +3632,7 @@
           </w:tcPr>
           <w:p>
             <w:r>
-              <w:t xml:space="preserve">The import functions to import </w:t>
-            </w:r>
-            <w:proofErr w:type="spellStart"/>
-            <w:r>
-              <w:t>Compumedics</w:t>
-            </w:r>
-            <w:proofErr w:type="spellEnd"/>
-            <w:r>
-              <w:t xml:space="preserve"> 257 system EDF datasets are now operational.</w:t>
+              <w:t>The import functions to import Compumedics 257 system EDF datasets are now operational.</w:t>
             </w:r>
           </w:p>
         </w:tc>
@@ -1978,23 +3720,7 @@
                 <w:b/>
                 <w:bCs/>
               </w:rPr>
-              <w:t xml:space="preserve">Added channel cluster indices for </w:t>
-            </w:r>
-            <w:proofErr w:type="spellStart"/>
-            <w:r>
-              <w:rPr>
-                <w:b/>
-                <w:bCs/>
-              </w:rPr>
-              <w:t>Compumedics</w:t>
-            </w:r>
-            <w:proofErr w:type="spellEnd"/>
-            <w:r>
-              <w:rPr>
-                <w:b/>
-                <w:bCs/>
-              </w:rPr>
-              <w:t xml:space="preserve"> 257 system</w:t>
+              <w:t>Added channel cluster indices for Compumedics 257 system</w:t>
             </w:r>
           </w:p>
         </w:tc>
@@ -2037,15 +3763,7 @@
           </w:tcPr>
           <w:p>
             <w:r>
-              <w:t xml:space="preserve">The clusters of the </w:t>
-            </w:r>
-            <w:proofErr w:type="spellStart"/>
-            <w:r>
-              <w:t>Compumedics</w:t>
-            </w:r>
-            <w:proofErr w:type="spellEnd"/>
-            <w:r>
-              <w:t xml:space="preserve"> 257 electrodes are matched to the major scalp divisions based on the EGI257 system. For any other system, all channels will be set to cluster 1 by default.</w:t>
+              <w:t>The clusters of the Compumedics 257 electrodes are matched to the major scalp divisions based on the EGI257 system. For any other system, all channels will be set to cluster 1 by default.</w:t>
             </w:r>
           </w:p>
         </w:tc>
@@ -2264,23 +3982,7 @@
                 <w:b/>
                 <w:bCs/>
               </w:rPr>
-              <w:t xml:space="preserve">In select and </w:t>
-            </w:r>
-            <w:proofErr w:type="spellStart"/>
-            <w:r>
-              <w:rPr>
-                <w:b/>
-                <w:bCs/>
-              </w:rPr>
-              <w:t>preproc</w:t>
-            </w:r>
-            <w:proofErr w:type="spellEnd"/>
-            <w:r>
-              <w:rPr>
-                <w:b/>
-                <w:bCs/>
-              </w:rPr>
-              <w:t xml:space="preserve"> process, remove non-cranial channels (HD-EEG only)</w:t>
+              <w:t>In select and preproc process, remove non-cranial channels (HD-EEG only)</w:t>
             </w:r>
           </w:p>
         </w:tc>
@@ -2323,23 +4025,7 @@
           </w:tcPr>
           <w:p>
             <w:r>
-              <w:t xml:space="preserve">For HD-EEG recordings (EGI-257 or Compumedics-257), the default setting in the ‘select and </w:t>
-            </w:r>
-            <w:proofErr w:type="spellStart"/>
-            <w:r>
-              <w:t>preprocess</w:t>
-            </w:r>
-            <w:proofErr w:type="spellEnd"/>
-            <w:r>
-              <w:t xml:space="preserve">’ menu is to remove non-cranial channels. This option is not available for other systems (e.g., </w:t>
-            </w:r>
-            <w:proofErr w:type="spellStart"/>
-            <w:r>
-              <w:t>Grael</w:t>
-            </w:r>
-            <w:proofErr w:type="spellEnd"/>
-            <w:r>
-              <w:t>). It is not recommended to perform this step if source localization analyses will be performed. If selected, the removal of these non-cranial channels is done after removal of rejected independent components, and before interpolation of rejected channels and before average referencing.</w:t>
+              <w:t>For HD-EEG recordings (EGI-257 or Compumedics-257), the default setting in the ‘select and preprocess’ menu is to remove non-cranial channels. This option is not available for other systems (e.g., Grael). It is not recommended to perform this step if source localization analyses will be performed. If selected, the removal of these non-cranial channels is done after removal of rejected independent components, and before interpolation of rejected channels and before average referencing.</w:t>
             </w:r>
           </w:p>
         </w:tc>
@@ -2427,23 +4113,7 @@
                 <w:b/>
                 <w:bCs/>
               </w:rPr>
-              <w:t xml:space="preserve">In select and </w:t>
-            </w:r>
-            <w:proofErr w:type="spellStart"/>
-            <w:r>
-              <w:rPr>
-                <w:b/>
-                <w:bCs/>
-              </w:rPr>
-              <w:t>preproc</w:t>
-            </w:r>
-            <w:proofErr w:type="spellEnd"/>
-            <w:r>
-              <w:rPr>
-                <w:b/>
-                <w:bCs/>
-              </w:rPr>
-              <w:t xml:space="preserve"> process, create separate files for each event instance</w:t>
+              <w:t>In select and preproc process, create separate files for each event instance</w:t>
             </w:r>
           </w:p>
         </w:tc>
@@ -2491,13 +4161,8 @@
             <w:r>
               <w:t>. The ‘</w:t>
             </w:r>
-            <w:proofErr w:type="spellStart"/>
-            <w:r>
-              <w:t>desc</w:t>
-            </w:r>
-            <w:proofErr w:type="spellEnd"/>
-            <w:r>
-              <w:t>’</w:t>
+            <w:r>
+              <w:t>desc’</w:t>
             </w:r>
             <w:r>
               <w:t xml:space="preserve"> key-value pair will </w:t>
@@ -2625,6 +4290,7 @@
                 <w:sz w:val="14"/>
                 <w:szCs w:val="14"/>
               </w:rPr>
+              <w:lastRenderedPageBreak/>
               <w:t>Version 2.0.0</w:t>
             </w:r>
             <w:r>
@@ -2980,7 +4646,6 @@
                 <w:bCs/>
                 <w:color w:val="538135" w:themeColor="accent6" w:themeShade="BF"/>
               </w:rPr>
-              <w:lastRenderedPageBreak/>
               <w:t>ADDED</w:t>
             </w:r>
           </w:p>
@@ -3329,15 +4994,7 @@
           </w:tcPr>
           <w:p>
             <w:r>
-              <w:t>According to the BIDS guidelines version 1.8.0, all filenames of EEG recordings end with the data type ‘_</w:t>
-            </w:r>
-            <w:proofErr w:type="spellStart"/>
-            <w:r>
-              <w:t>eeg</w:t>
-            </w:r>
-            <w:proofErr w:type="spellEnd"/>
-            <w:r>
-              <w:t xml:space="preserve">’. </w:t>
+              <w:t xml:space="preserve">According to the BIDS guidelines version 1.8.0, all filenames of EEG recordings end with the data type ‘_eeg’. </w:t>
             </w:r>
             <w:r>
               <w:t>D</w:t>
@@ -3437,23 +5094,7 @@
                 <w:b/>
                 <w:bCs/>
               </w:rPr>
-              <w:t xml:space="preserve">Incorrect spherical channel coordinates for imported </w:t>
-            </w:r>
-            <w:proofErr w:type="spellStart"/>
-            <w:r>
-              <w:rPr>
-                <w:b/>
-                <w:bCs/>
-              </w:rPr>
-              <w:t>geoscan</w:t>
-            </w:r>
-            <w:proofErr w:type="spellEnd"/>
-            <w:r>
-              <w:rPr>
-                <w:b/>
-                <w:bCs/>
-              </w:rPr>
-              <w:t xml:space="preserve"> files</w:t>
+              <w:t>Incorrect spherical channel coordinates for imported geoscan files</w:t>
             </w:r>
           </w:p>
         </w:tc>
@@ -3517,21 +5158,11 @@
           </w:tcPr>
           <w:p>
             <w:r>
-              <w:t>Whilst the cartesian channel coordinates were correct, the spherical coordinates were not. The ‘</w:t>
-            </w:r>
-            <w:proofErr w:type="spellStart"/>
-            <w:r>
-              <w:t>topoplot</w:t>
-            </w:r>
-            <w:proofErr w:type="spellEnd"/>
-            <w:r>
-              <w:t xml:space="preserve">’ function uses the spherical coordinates and this resulted in a switch between left and right. This error is now automatically detected when you open your </w:t>
-            </w:r>
-            <w:proofErr w:type="gramStart"/>
+              <w:t xml:space="preserve">Whilst the cartesian channel coordinates were correct, the spherical coordinates were not. The ‘topoplot’ function uses the spherical coordinates and this resulted in a switch between left and right. This error is now automatically detected when you open your </w:t>
+            </w:r>
             <w:r>
               <w:t>recording</w:t>
             </w:r>
-            <w:proofErr w:type="gramEnd"/>
             <w:r>
               <w:t xml:space="preserve"> and all header files are </w:t>
             </w:r>
@@ -3992,15 +5623,7 @@
           </w:tcPr>
           <w:p>
             <w:r>
-              <w:t xml:space="preserve">In the process ‘Select and </w:t>
-            </w:r>
-            <w:proofErr w:type="spellStart"/>
-            <w:r>
-              <w:t>preprocess</w:t>
-            </w:r>
-            <w:proofErr w:type="spellEnd"/>
-            <w:r>
-              <w:t xml:space="preserve"> data’, an error occurred when selecting part of a recording using timepoints. </w:t>
+              <w:t xml:space="preserve">In the process ‘Select and preprocess data’, an error occurred when selecting part of a recording using timepoints. </w:t>
             </w:r>
           </w:p>
         </w:tc>
@@ -4306,6 +5929,13 @@
                 <w:szCs w:val="14"/>
               </w:rPr>
               <w:br/>
+            </w:r>
+            <w:r>
+              <w:rPr>
+                <w:sz w:val="14"/>
+                <w:szCs w:val="14"/>
+              </w:rPr>
+              <w:lastRenderedPageBreak/>
               <w:t>11 Jan 2023</w:t>
             </w:r>
           </w:p>
@@ -4316,6 +5946,7 @@
           </w:tcPr>
           <w:p>
             <w:r>
+              <w:lastRenderedPageBreak/>
               <w:t>The files of the currently loaded dataset and of the newly loaded dataset would not be shown correctly.</w:t>
             </w:r>
           </w:p>
@@ -4398,23 +6029,7 @@
                 <w:b/>
                 <w:bCs/>
               </w:rPr>
-              <w:t>Derivatives directory ‘EEG-select’ becomes ‘EEG-</w:t>
-            </w:r>
-            <w:proofErr w:type="spellStart"/>
-            <w:r>
-              <w:rPr>
-                <w:b/>
-                <w:bCs/>
-              </w:rPr>
-              <w:t>preproc</w:t>
-            </w:r>
-            <w:proofErr w:type="spellEnd"/>
-            <w:r>
-              <w:rPr>
-                <w:b/>
-                <w:bCs/>
-              </w:rPr>
-              <w:t>’</w:t>
+              <w:t>Derivatives directory ‘EEG-select’ becomes ‘EEG-preproc’</w:t>
             </w:r>
           </w:p>
         </w:tc>
@@ -4473,23 +6088,7 @@
           </w:tcPr>
           <w:p>
             <w:r>
-              <w:t>It was judged that the name ‘EEG-</w:t>
-            </w:r>
-            <w:proofErr w:type="spellStart"/>
-            <w:r>
-              <w:t>preproc</w:t>
-            </w:r>
-            <w:proofErr w:type="spellEnd"/>
-            <w:r>
-              <w:t>’ is a better descriptor of the contents of this derivatives directory. For legacy support, the directory is named ‘EEG-</w:t>
-            </w:r>
-            <w:proofErr w:type="spellStart"/>
-            <w:r>
-              <w:t>preproc</w:t>
-            </w:r>
-            <w:proofErr w:type="spellEnd"/>
-            <w:r>
-              <w:t xml:space="preserve">’ only if the database does not </w:t>
+              <w:t xml:space="preserve">It was judged that the name ‘EEG-preproc’ is a better descriptor of the contents of this derivatives directory. For legacy support, the directory is named ‘EEG-preproc’ only if the database does not </w:t>
             </w:r>
             <w:r>
               <w:t xml:space="preserve">already </w:t>
@@ -4636,15 +6235,7 @@
           </w:tcPr>
           <w:p>
             <w:r>
-              <w:t>Only the ‘</w:t>
-            </w:r>
-            <w:proofErr w:type="spellStart"/>
-            <w:r>
-              <w:t>Events_User</w:t>
-            </w:r>
-            <w:proofErr w:type="spellEnd"/>
-            <w:r>
-              <w:t xml:space="preserve"> Markup.xml’ file used to be imported. However, when triggers are sent from e.g., E-Prime, these event makers are stored in separate XML files. Now, any event XML file from within the MFF package are automatically imported.</w:t>
+              <w:t>Only the ‘Events_User Markup.xml’ file used to be imported. However, when triggers are sent from e.g., E-Prime, these event makers are stored in separate XML files. Now, any event XML file from within the MFF package are automatically imported.</w:t>
             </w:r>
           </w:p>
         </w:tc>
@@ -4703,7 +6294,6 @@
                 <w:bCs/>
                 <w:color w:val="2F5496" w:themeColor="accent1" w:themeShade="BF"/>
               </w:rPr>
-              <w:lastRenderedPageBreak/>
               <w:t>FIXED</w:t>
             </w:r>
           </w:p>
@@ -4797,15 +6387,7 @@
           </w:tcPr>
           <w:p>
             <w:r>
-              <w:t>When a recording was resampled, the variable ‘</w:t>
-            </w:r>
-            <w:proofErr w:type="spellStart"/>
-            <w:r>
-              <w:t>SamplingFrequency</w:t>
-            </w:r>
-            <w:proofErr w:type="spellEnd"/>
-            <w:r>
-              <w:t>’ in the JSON sidecar file was not updated, now it is.</w:t>
+              <w:t>When a recording was resampled, the variable ‘SamplingFrequency’ in the JSON sidecar file was not updated, now it is.</w:t>
             </w:r>
           </w:p>
         </w:tc>
@@ -4957,23 +6539,10 @@
           </w:tcPr>
           <w:p>
             <w:r>
-              <w:t>The ‘</w:t>
-            </w:r>
-            <w:proofErr w:type="spellStart"/>
-            <w:r>
-              <w:t>EEG.etc.rec_startdate</w:t>
-            </w:r>
-            <w:proofErr w:type="spellEnd"/>
-            <w:r>
-              <w:t>’ variable used to be only defined when importing external events along with importing MFF recordings. Now this variable is initialized in ‘</w:t>
-            </w:r>
-            <w:proofErr w:type="spellStart"/>
-            <w:r>
-              <w:t>mff_newset.m</w:t>
-            </w:r>
-            <w:proofErr w:type="spellEnd"/>
-            <w:r>
-              <w:t>’.</w:t>
+              <w:t>The ‘EEG.etc.rec_startdate’ variable used to be only defined when importing external events along with importing MFF recordings. Now this variable is initialized in ‘</w:t>
+            </w:r>
+            <w:r>
+              <w:t>mff_newset.m’.</w:t>
             </w:r>
           </w:p>
         </w:tc>
@@ -5061,23 +6630,7 @@
                 <w:b/>
                 <w:bCs/>
               </w:rPr>
-              <w:t>Making sure ‘</w:t>
-            </w:r>
-            <w:proofErr w:type="spellStart"/>
-            <w:r>
-              <w:rPr>
-                <w:b/>
-                <w:bCs/>
-              </w:rPr>
-              <w:t>rec_startdate</w:t>
-            </w:r>
-            <w:proofErr w:type="spellEnd"/>
-            <w:r>
-              <w:rPr>
-                <w:b/>
-                <w:bCs/>
-              </w:rPr>
-              <w:t>’ is the correct variable type</w:t>
+              <w:t>Making sure ‘rec_startdate’ is the correct variable type</w:t>
             </w:r>
           </w:p>
         </w:tc>
@@ -5141,23 +6694,7 @@
           </w:tcPr>
           <w:p>
             <w:r>
-              <w:t>When using the function ‘</w:t>
-            </w:r>
-            <w:proofErr w:type="spellStart"/>
-            <w:r>
-              <w:t>compumed_import_sleep_events.m</w:t>
-            </w:r>
-            <w:proofErr w:type="spellEnd"/>
-            <w:r>
-              <w:t>’ on an existing file, then the variable ‘</w:t>
-            </w:r>
-            <w:proofErr w:type="spellStart"/>
-            <w:r>
-              <w:t>rec_startdate</w:t>
-            </w:r>
-            <w:proofErr w:type="spellEnd"/>
-            <w:r>
-              <w:t>’ should be a date-string, which would result in an error. Now a check has been added to convert the variable to a date-number if this is not the case.</w:t>
+              <w:t>When using the function ‘compumed_import_sleep_events.m’ on an existing file, then the variable ‘rec_startdate’ should be a date-string, which would result in an error. Now a check has been added to convert the variable to a date-number if this is not the case.</w:t>
             </w:r>
           </w:p>
         </w:tc>

</xml_diff>